<commit_message>
[UPDATE]: projeto de extensão
</commit_message>
<xml_diff>
--- a/documentos/Documento - Projeto de Extensão - COM Empresa.docx
+++ b/documentos/Documento - Projeto de Extensão - COM Empresa.docx
@@ -135,29 +135,19 @@
             <w:pPr>
               <w:rPr>
                 <w:rFonts w:ascii="Arial" w:eastAsia="Arial" w:hAnsi="Arial" w:cs="Arial"/>
-                <w:color w:val="525252" w:themeColor="accent3" w:themeShade="80"/>
-                <w:sz w:val="20"/>
-                <w:szCs w:val="20"/>
-              </w:rPr>
-            </w:pPr>
-            <w:r>
-              <w:rPr>
-                <w:rFonts w:ascii="Arial" w:eastAsia="Arial" w:hAnsi="Arial" w:cs="Arial"/>
-                <w:color w:val="525252" w:themeColor="accent3" w:themeShade="80"/>
-                <w:sz w:val="20"/>
-                <w:szCs w:val="20"/>
-              </w:rPr>
-              <w:t>Inserir os dados neste espaço. Orientações: descrição sucinta englobando o tema do projeto.</w:t>
-            </w:r>
-          </w:p>
-          <w:p>
-            <w:pPr>
-              <w:rPr>
-                <w:rFonts w:ascii="Arial" w:eastAsia="Arial" w:hAnsi="Arial" w:cs="Arial"/>
-                <w:sz w:val="20"/>
-                <w:szCs w:val="20"/>
-              </w:rPr>
-            </w:pPr>
+                <w:sz w:val="20"/>
+                <w:szCs w:val="20"/>
+              </w:rPr>
+            </w:pPr>
+            <w:r>
+              <w:rPr>
+                <w:rFonts w:ascii="Arial" w:eastAsia="Arial" w:hAnsi="Arial" w:cs="Arial"/>
+                <w:color w:val="525252" w:themeColor="accent3" w:themeShade="80"/>
+                <w:sz w:val="20"/>
+                <w:szCs w:val="20"/>
+              </w:rPr>
+              <w:t>Sistema Inteligente de Gestão de Energia (SIGE): Monitoramento e Eficiência no Consumo Elétrico.</w:t>
+            </w:r>
           </w:p>
         </w:tc>
       </w:tr>
@@ -248,7 +238,6 @@
         <w:tc>
           <w:tcPr>
             <w:tcW w:w="6675" w:type="dxa"/>
-            <w:shd w:val="clear" w:color="auto" w:fill="auto"/>
           </w:tcPr>
           <w:p>
             <w:pPr>
@@ -284,7 +273,6 @@
         <w:tc>
           <w:tcPr>
             <w:tcW w:w="2700" w:type="dxa"/>
-            <w:shd w:val="clear" w:color="auto" w:fill="auto"/>
           </w:tcPr>
           <w:p>
             <w:pPr>
@@ -311,7 +299,6 @@
         <w:tc>
           <w:tcPr>
             <w:tcW w:w="6675" w:type="dxa"/>
-            <w:shd w:val="clear" w:color="auto" w:fill="auto"/>
           </w:tcPr>
           <w:p>
             <w:pPr>
@@ -343,12 +330,20 @@
                 <w:szCs w:val="20"/>
               </w:rPr>
             </w:pPr>
+            <w:r>
+              <w:rPr>
+                <w:rFonts w:ascii="Arial" w:eastAsia="Arial" w:hAnsi="Arial" w:cs="Arial"/>
+                <w:b/>
+                <w:sz w:val="20"/>
+                <w:szCs w:val="20"/>
+              </w:rPr>
+              <w:t>Flavio José dos Santos</w:t>
+            </w:r>
           </w:p>
         </w:tc>
         <w:tc>
           <w:tcPr>
             <w:tcW w:w="2700" w:type="dxa"/>
-            <w:shd w:val="clear" w:color="auto" w:fill="auto"/>
           </w:tcPr>
           <w:p>
             <w:pPr>
@@ -360,6 +355,26 @@
                 <w:szCs w:val="20"/>
               </w:rPr>
             </w:pPr>
+          </w:p>
+          <w:p>
+            <w:pPr>
+              <w:spacing w:after="0" w:line="240" w:lineRule="auto"/>
+              <w:rPr>
+                <w:rFonts w:ascii="Arial" w:eastAsia="Arial" w:hAnsi="Arial" w:cs="Arial"/>
+                <w:b/>
+                <w:sz w:val="20"/>
+                <w:szCs w:val="20"/>
+              </w:rPr>
+            </w:pPr>
+            <w:r>
+              <w:rPr>
+                <w:rFonts w:ascii="Arial" w:eastAsia="Arial" w:hAnsi="Arial" w:cs="Arial"/>
+                <w:b/>
+                <w:sz w:val="20"/>
+                <w:szCs w:val="20"/>
+              </w:rPr>
+              <w:t>23025666</w:t>
+            </w:r>
           </w:p>
         </w:tc>
       </w:tr>
@@ -367,7 +382,6 @@
         <w:tc>
           <w:tcPr>
             <w:tcW w:w="6675" w:type="dxa"/>
-            <w:shd w:val="clear" w:color="auto" w:fill="auto"/>
           </w:tcPr>
           <w:p>
             <w:pPr>
@@ -390,12 +404,20 @@
                 <w:szCs w:val="20"/>
               </w:rPr>
             </w:pPr>
+            <w:r>
+              <w:rPr>
+                <w:rFonts w:ascii="Arial" w:eastAsia="Arial" w:hAnsi="Arial" w:cs="Arial"/>
+                <w:b/>
+                <w:sz w:val="20"/>
+                <w:szCs w:val="20"/>
+              </w:rPr>
+              <w:t>Maria Eduarda Freitas Lopes</w:t>
+            </w:r>
           </w:p>
         </w:tc>
         <w:tc>
           <w:tcPr>
             <w:tcW w:w="2700" w:type="dxa"/>
-            <w:shd w:val="clear" w:color="auto" w:fill="auto"/>
           </w:tcPr>
           <w:p>
             <w:pPr>
@@ -407,6 +429,26 @@
                 <w:szCs w:val="20"/>
               </w:rPr>
             </w:pPr>
+          </w:p>
+          <w:p>
+            <w:pPr>
+              <w:spacing w:after="0" w:line="240" w:lineRule="auto"/>
+              <w:rPr>
+                <w:rFonts w:ascii="Arial" w:eastAsia="Arial" w:hAnsi="Arial" w:cs="Arial"/>
+                <w:b/>
+                <w:sz w:val="20"/>
+                <w:szCs w:val="20"/>
+              </w:rPr>
+            </w:pPr>
+            <w:r>
+              <w:rPr>
+                <w:rFonts w:ascii="Arial" w:eastAsia="Arial" w:hAnsi="Arial" w:cs="Arial"/>
+                <w:b/>
+                <w:sz w:val="20"/>
+                <w:szCs w:val="20"/>
+              </w:rPr>
+              <w:t>23025447</w:t>
+            </w:r>
           </w:p>
         </w:tc>
       </w:tr>
@@ -414,7 +456,6 @@
         <w:tc>
           <w:tcPr>
             <w:tcW w:w="6675" w:type="dxa"/>
-            <w:shd w:val="clear" w:color="auto" w:fill="auto"/>
           </w:tcPr>
           <w:p>
             <w:pPr>
@@ -437,12 +478,31 @@
                 <w:szCs w:val="20"/>
               </w:rPr>
             </w:pPr>
+            <w:r>
+              <w:rPr>
+                <w:rFonts w:ascii="Arial" w:eastAsia="Arial" w:hAnsi="Arial" w:cs="Arial"/>
+                <w:b/>
+                <w:sz w:val="20"/>
+                <w:szCs w:val="20"/>
+              </w:rPr>
+              <w:t xml:space="preserve">Felipe Carvalho </w:t>
+            </w:r>
+            <w:proofErr w:type="spellStart"/>
+            <w:r>
+              <w:rPr>
+                <w:rFonts w:ascii="Arial" w:eastAsia="Arial" w:hAnsi="Arial" w:cs="Arial"/>
+                <w:b/>
+                <w:sz w:val="20"/>
+                <w:szCs w:val="20"/>
+              </w:rPr>
+              <w:t>Paleari</w:t>
+            </w:r>
+            <w:proofErr w:type="spellEnd"/>
           </w:p>
         </w:tc>
         <w:tc>
           <w:tcPr>
             <w:tcW w:w="2700" w:type="dxa"/>
-            <w:shd w:val="clear" w:color="auto" w:fill="auto"/>
           </w:tcPr>
           <w:p>
             <w:pPr>
@@ -454,6 +514,26 @@
                 <w:szCs w:val="20"/>
               </w:rPr>
             </w:pPr>
+          </w:p>
+          <w:p>
+            <w:pPr>
+              <w:spacing w:after="0" w:line="240" w:lineRule="auto"/>
+              <w:rPr>
+                <w:rFonts w:ascii="Arial" w:eastAsia="Arial" w:hAnsi="Arial" w:cs="Arial"/>
+                <w:b/>
+                <w:sz w:val="20"/>
+                <w:szCs w:val="20"/>
+              </w:rPr>
+            </w:pPr>
+            <w:r>
+              <w:rPr>
+                <w:rFonts w:ascii="Arial" w:eastAsia="Arial" w:hAnsi="Arial" w:cs="Arial"/>
+                <w:b/>
+                <w:sz w:val="20"/>
+                <w:szCs w:val="20"/>
+              </w:rPr>
+              <w:t>25027800</w:t>
+            </w:r>
           </w:p>
         </w:tc>
       </w:tr>
@@ -461,7 +541,6 @@
         <w:tc>
           <w:tcPr>
             <w:tcW w:w="6675" w:type="dxa"/>
-            <w:shd w:val="clear" w:color="auto" w:fill="auto"/>
           </w:tcPr>
           <w:p>
             <w:pPr>
@@ -484,12 +563,20 @@
                 <w:szCs w:val="20"/>
               </w:rPr>
             </w:pPr>
+            <w:r>
+              <w:rPr>
+                <w:rFonts w:ascii="Arial" w:eastAsia="Arial" w:hAnsi="Arial" w:cs="Arial"/>
+                <w:b/>
+                <w:sz w:val="20"/>
+                <w:szCs w:val="20"/>
+              </w:rPr>
+              <w:t>Jenifer Jacino Barreto</w:t>
+            </w:r>
           </w:p>
         </w:tc>
         <w:tc>
           <w:tcPr>
             <w:tcW w:w="2700" w:type="dxa"/>
-            <w:shd w:val="clear" w:color="auto" w:fill="auto"/>
           </w:tcPr>
           <w:p>
             <w:pPr>
@@ -501,6 +588,26 @@
                 <w:szCs w:val="20"/>
               </w:rPr>
             </w:pPr>
+          </w:p>
+          <w:p>
+            <w:pPr>
+              <w:spacing w:after="0" w:line="240" w:lineRule="auto"/>
+              <w:rPr>
+                <w:rFonts w:ascii="Arial" w:eastAsia="Arial" w:hAnsi="Arial" w:cs="Arial"/>
+                <w:b/>
+                <w:sz w:val="20"/>
+                <w:szCs w:val="20"/>
+              </w:rPr>
+            </w:pPr>
+            <w:r>
+              <w:rPr>
+                <w:rFonts w:ascii="Arial" w:eastAsia="Arial" w:hAnsi="Arial" w:cs="Arial"/>
+                <w:b/>
+                <w:sz w:val="20"/>
+                <w:szCs w:val="20"/>
+              </w:rPr>
+              <w:t>23025664</w:t>
+            </w:r>
           </w:p>
         </w:tc>
       </w:tr>
@@ -604,17 +711,27 @@
                 <w:sz w:val="20"/>
                 <w:szCs w:val="20"/>
               </w:rPr>
-              <w:t>Inserir os dados neste espaço. Orientações: inserir o nome completo do professor responsável pela Atividade de Extensão.</w:t>
-            </w:r>
-            <w:r>
-              <w:rPr>
-                <w:rFonts w:ascii="Arial" w:eastAsia="Arial" w:hAnsi="Arial" w:cs="Arial"/>
-                <w:b/>
-                <w:color w:val="525252" w:themeColor="accent3" w:themeShade="80"/>
-                <w:sz w:val="16"/>
-                <w:szCs w:val="16"/>
-              </w:rPr>
-              <w:t xml:space="preserve"> </w:t>
+              <w:t xml:space="preserve">Joao Francisco </w:t>
+            </w:r>
+            <w:proofErr w:type="spellStart"/>
+            <w:r>
+              <w:rPr>
+                <w:rFonts w:ascii="Arial" w:eastAsia="Arial" w:hAnsi="Arial" w:cs="Arial"/>
+                <w:color w:val="525252" w:themeColor="accent3" w:themeShade="80"/>
+                <w:sz w:val="20"/>
+                <w:szCs w:val="20"/>
+              </w:rPr>
+              <w:t>Trencher</w:t>
+            </w:r>
+            <w:proofErr w:type="spellEnd"/>
+            <w:r>
+              <w:rPr>
+                <w:rFonts w:ascii="Arial" w:eastAsia="Arial" w:hAnsi="Arial" w:cs="Arial"/>
+                <w:color w:val="525252" w:themeColor="accent3" w:themeShade="80"/>
+                <w:sz w:val="20"/>
+                <w:szCs w:val="20"/>
+              </w:rPr>
+              <w:t xml:space="preserve"> Martins</w:t>
             </w:r>
           </w:p>
         </w:tc>
@@ -718,26 +835,7 @@
                 <w:sz w:val="20"/>
                 <w:szCs w:val="20"/>
               </w:rPr>
-              <w:t>Inserir os dados neste espaço. Orientações:</w:t>
-            </w:r>
-            <w:r>
-              <w:rPr>
-                <w:rFonts w:ascii="Arial" w:eastAsia="Arial" w:hAnsi="Arial" w:cs="Arial"/>
-                <w:b/>
-                <w:color w:val="525252" w:themeColor="accent3" w:themeShade="80"/>
-                <w:sz w:val="16"/>
-                <w:szCs w:val="16"/>
-              </w:rPr>
-              <w:t xml:space="preserve"> </w:t>
-            </w:r>
-            <w:r>
-              <w:rPr>
-                <w:rFonts w:ascii="Arial" w:eastAsia="Arial" w:hAnsi="Arial" w:cs="Arial"/>
-                <w:color w:val="525252" w:themeColor="accent3" w:themeShade="80"/>
-                <w:sz w:val="20"/>
-                <w:szCs w:val="20"/>
-              </w:rPr>
-              <w:t>inserir o nome do curso de graduação.</w:t>
+              <w:t>Ciência da Computação</w:t>
             </w:r>
           </w:p>
         </w:tc>
@@ -842,7 +940,6 @@
               <w:left w:val="single" w:sz="4" w:space="0" w:color="000000"/>
               <w:bottom w:val="single" w:sz="4" w:space="0" w:color="000000"/>
             </w:tcBorders>
-            <w:shd w:val="clear" w:color="auto" w:fill="auto"/>
           </w:tcPr>
           <w:p>
             <w:pPr>
@@ -891,7 +988,6 @@
               <w:bottom w:val="single" w:sz="4" w:space="0" w:color="000000"/>
               <w:right w:val="single" w:sz="4" w:space="0" w:color="000000"/>
             </w:tcBorders>
-            <w:shd w:val="clear" w:color="auto" w:fill="auto"/>
           </w:tcPr>
           <w:p>
             <w:pPr>
@@ -1038,7 +1134,7 @@
             <w:pPr>
               <w:numPr>
                 <w:ilvl w:val="0"/>
-                <w:numId w:val="1"/>
+                <w:numId w:val="2"/>
               </w:numPr>
               <w:shd w:val="clear" w:color="auto" w:fill="FFFFFF"/>
               <w:spacing w:after="0" w:line="240" w:lineRule="auto"/>
@@ -1102,7 +1198,6 @@
         <w:tc>
           <w:tcPr>
             <w:tcW w:w="9355" w:type="dxa"/>
-            <w:shd w:val="clear" w:color="auto" w:fill="auto"/>
             <w:tcMar>
               <w:top w:w="100" w:type="dxa"/>
               <w:left w:w="100" w:type="dxa"/>
@@ -1121,57 +1216,22 @@
                 <w:between w:val="nil"/>
               </w:pBdr>
               <w:spacing w:after="0" w:line="240" w:lineRule="auto"/>
-              <w:rPr>
-                <w:rFonts w:ascii="Arial" w:eastAsia="Arial" w:hAnsi="Arial" w:cs="Arial"/>
-                <w:b/>
-                <w:sz w:val="20"/>
-                <w:szCs w:val="20"/>
-              </w:rPr>
-            </w:pPr>
-            <w:r>
-              <w:rPr>
-                <w:rFonts w:ascii="Arial" w:eastAsia="Arial" w:hAnsi="Arial" w:cs="Arial"/>
-                <w:color w:val="525252" w:themeColor="accent3" w:themeShade="80"/>
-                <w:sz w:val="20"/>
-                <w:szCs w:val="20"/>
-              </w:rPr>
-              <w:t xml:space="preserve">Estabelecido conforme </w:t>
-            </w:r>
-            <w:r>
-              <w:rPr>
-                <w:rFonts w:ascii="Arial" w:eastAsia="Arial" w:hAnsi="Arial" w:cs="Arial"/>
-                <w:color w:val="525252" w:themeColor="accent3" w:themeShade="80"/>
-                <w:sz w:val="20"/>
-                <w:szCs w:val="20"/>
-              </w:rPr>
-              <w:t>seleção da ODS e dos</w:t>
-            </w:r>
-            <w:r>
-              <w:rPr>
-                <w:rFonts w:ascii="Arial" w:eastAsia="Arial" w:hAnsi="Arial" w:cs="Arial"/>
-                <w:color w:val="525252" w:themeColor="accent3" w:themeShade="80"/>
-                <w:sz w:val="20"/>
-                <w:szCs w:val="20"/>
-              </w:rPr>
-              <w:t xml:space="preserve"> conhecimento</w:t>
-            </w:r>
-            <w:r>
-              <w:rPr>
-                <w:rFonts w:ascii="Arial" w:eastAsia="Arial" w:hAnsi="Arial" w:cs="Arial"/>
-                <w:color w:val="525252" w:themeColor="accent3" w:themeShade="80"/>
-                <w:sz w:val="20"/>
-                <w:szCs w:val="20"/>
-              </w:rPr>
-              <w:t>s a</w:t>
-            </w:r>
-            <w:r>
-              <w:rPr>
-                <w:rFonts w:ascii="Arial" w:eastAsia="Arial" w:hAnsi="Arial" w:cs="Arial"/>
-                <w:color w:val="525252" w:themeColor="accent3" w:themeShade="80"/>
-                <w:sz w:val="20"/>
-                <w:szCs w:val="20"/>
-              </w:rPr>
-              <w:t xml:space="preserve"> serem trabalhados e orientações do docente.</w:t>
+              <w:jc w:val="both"/>
+              <w:rPr>
+                <w:rFonts w:ascii="Arial" w:eastAsia="Arial" w:hAnsi="Arial" w:cs="Arial"/>
+                <w:b/>
+                <w:sz w:val="20"/>
+                <w:szCs w:val="20"/>
+              </w:rPr>
+            </w:pPr>
+            <w:r>
+              <w:rPr>
+                <w:rFonts w:ascii="Arial" w:eastAsia="Arial" w:hAnsi="Arial" w:cs="Arial"/>
+                <w:color w:val="525252" w:themeColor="accent3" w:themeShade="80"/>
+                <w:sz w:val="20"/>
+                <w:szCs w:val="20"/>
+              </w:rPr>
+              <w:t>O projeto baseia-se na eficiência energética e segurança elétrica, utilizando tecnologias de baixo custo para transformar a relação do usuário com o consumo de energia em tempo real. A iniciativa alinha-se aos Objetivos de Desenvolvimento Sustentável (ODS) da ONU, promovendo especificamente o consumo e produção responsáveis (ODS 12), a inovação tecnológica em infraestrutura (ODS 9) e o acesso à energia limpa e eficiente (ODS 7).</w:t>
             </w:r>
           </w:p>
         </w:tc>
@@ -1238,7 +1298,118 @@
                 <w:sz w:val="20"/>
                 <w:szCs w:val="20"/>
               </w:rPr>
-              <w:t xml:space="preserve">Inserir os dados neste espaço. </w:t>
+              <w:t xml:space="preserve">O </w:t>
+            </w:r>
+            <w:proofErr w:type="gramStart"/>
+            <w:r>
+              <w:rPr>
+                <w:rFonts w:ascii="Arial" w:eastAsia="Arial" w:hAnsi="Arial" w:cs="Arial"/>
+                <w:color w:val="525252" w:themeColor="accent3" w:themeShade="80"/>
+                <w:sz w:val="20"/>
+                <w:szCs w:val="20"/>
+              </w:rPr>
+              <w:t>produto final</w:t>
+            </w:r>
+            <w:proofErr w:type="gramEnd"/>
+            <w:r>
+              <w:rPr>
+                <w:rFonts w:ascii="Arial" w:eastAsia="Arial" w:hAnsi="Arial" w:cs="Arial"/>
+                <w:color w:val="525252" w:themeColor="accent3" w:themeShade="80"/>
+                <w:sz w:val="20"/>
+                <w:szCs w:val="20"/>
+              </w:rPr>
+              <w:t xml:space="preserve"> constitui-se em um ecossistema integrado de hardware e software:</w:t>
+            </w:r>
+            <w:r>
+              <w:rPr>
+                <w:rFonts w:ascii="Arial" w:eastAsia="Arial" w:hAnsi="Arial" w:cs="Arial"/>
+                <w:color w:val="525252" w:themeColor="accent3" w:themeShade="80"/>
+                <w:sz w:val="20"/>
+                <w:szCs w:val="20"/>
+              </w:rPr>
+              <w:t xml:space="preserve"> </w:t>
+            </w:r>
+            <w:r>
+              <w:rPr>
+                <w:rFonts w:ascii="Arial" w:eastAsia="Arial" w:hAnsi="Arial" w:cs="Arial"/>
+                <w:color w:val="525252" w:themeColor="accent3" w:themeShade="80"/>
+                <w:sz w:val="20"/>
+                <w:szCs w:val="20"/>
+              </w:rPr>
+              <w:t xml:space="preserve">Hardware: </w:t>
+            </w:r>
+            <w:r>
+              <w:rPr>
+                <w:rFonts w:ascii="Arial" w:eastAsia="Arial" w:hAnsi="Arial" w:cs="Arial"/>
+                <w:color w:val="525252" w:themeColor="accent3" w:themeShade="80"/>
+                <w:sz w:val="20"/>
+                <w:szCs w:val="20"/>
+              </w:rPr>
+              <w:t>Protótipo físico estruturado em maquete (casa inteligente) utilizando Arduino UNO para processamento lógico local, ESP32 para conectividade, sensores de efeito Hall e relés de estado sólido.</w:t>
+            </w:r>
+            <w:r>
+              <w:rPr>
+                <w:rFonts w:ascii="Arial" w:eastAsia="Arial" w:hAnsi="Arial" w:cs="Arial"/>
+                <w:color w:val="525252" w:themeColor="accent3" w:themeShade="80"/>
+                <w:sz w:val="20"/>
+                <w:szCs w:val="20"/>
+              </w:rPr>
+              <w:t xml:space="preserve"> </w:t>
+            </w:r>
+            <w:r>
+              <w:rPr>
+                <w:rFonts w:ascii="Arial" w:eastAsia="Arial" w:hAnsi="Arial" w:cs="Arial"/>
+                <w:color w:val="525252" w:themeColor="accent3" w:themeShade="80"/>
+                <w:sz w:val="20"/>
+                <w:szCs w:val="20"/>
+              </w:rPr>
+              <w:t xml:space="preserve">App Móvel (Cliente): </w:t>
+            </w:r>
+            <w:r>
+              <w:rPr>
+                <w:rFonts w:ascii="Arial" w:eastAsia="Arial" w:hAnsi="Arial" w:cs="Arial"/>
+                <w:color w:val="525252" w:themeColor="accent3" w:themeShade="80"/>
+                <w:sz w:val="20"/>
+                <w:szCs w:val="20"/>
+              </w:rPr>
+              <w:t xml:space="preserve">Interface intuitiva para o usuário final realizar o acompanhamento do consumo em tempo real e receber </w:t>
+            </w:r>
+            <w:r>
+              <w:rPr>
+                <w:rFonts w:ascii="Arial" w:eastAsia="Arial" w:hAnsi="Arial" w:cs="Arial"/>
+                <w:color w:val="525252" w:themeColor="accent3" w:themeShade="80"/>
+                <w:sz w:val="20"/>
+                <w:szCs w:val="20"/>
+              </w:rPr>
+              <w:lastRenderedPageBreak/>
+              <w:t>alertas críticos de segurança.</w:t>
+            </w:r>
+            <w:r>
+              <w:rPr>
+                <w:rFonts w:ascii="Arial" w:eastAsia="Arial" w:hAnsi="Arial" w:cs="Arial"/>
+                <w:color w:val="525252" w:themeColor="accent3" w:themeShade="80"/>
+                <w:sz w:val="20"/>
+                <w:szCs w:val="20"/>
+              </w:rPr>
+              <w:t xml:space="preserve"> </w:t>
+            </w:r>
+            <w:r>
+              <w:rPr>
+                <w:rFonts w:ascii="Arial" w:eastAsia="Arial" w:hAnsi="Arial" w:cs="Arial"/>
+                <w:color w:val="525252" w:themeColor="accent3" w:themeShade="80"/>
+                <w:sz w:val="20"/>
+                <w:szCs w:val="20"/>
+              </w:rPr>
+              <w:t xml:space="preserve">Site (Administração SIGE): </w:t>
+            </w:r>
+            <w:r>
+              <w:rPr>
+                <w:rFonts w:ascii="Arial" w:eastAsia="Arial" w:hAnsi="Arial" w:cs="Arial"/>
+                <w:color w:val="525252" w:themeColor="accent3" w:themeShade="80"/>
+                <w:sz w:val="20"/>
+                <w:szCs w:val="20"/>
+              </w:rPr>
+              <w:t>Portal web destinado à gestão administrativa, permitindo a análise técnica de métricas e auditoria de dados históricos.</w:t>
             </w:r>
           </w:p>
           <w:p>
@@ -1246,63 +1417,46 @@
               <w:shd w:val="clear" w:color="auto" w:fill="FFFFFF"/>
               <w:rPr>
                 <w:rFonts w:ascii="Arial" w:eastAsia="Arial" w:hAnsi="Arial" w:cs="Arial"/>
-                <w:color w:val="525252" w:themeColor="accent3" w:themeShade="80"/>
-                <w:sz w:val="20"/>
-                <w:szCs w:val="20"/>
-              </w:rPr>
-            </w:pPr>
-            <w:r>
-              <w:rPr>
-                <w:rFonts w:ascii="Arial" w:eastAsia="Arial" w:hAnsi="Arial" w:cs="Arial"/>
-                <w:color w:val="525252" w:themeColor="accent3" w:themeShade="80"/>
-                <w:sz w:val="20"/>
-                <w:szCs w:val="20"/>
-              </w:rPr>
-              <w:t>Orientações:</w:t>
-            </w:r>
-            <w:r>
-              <w:rPr>
-                <w:rFonts w:ascii="Arial" w:eastAsia="Arial" w:hAnsi="Arial" w:cs="Arial"/>
-                <w:b/>
-                <w:color w:val="525252" w:themeColor="accent3" w:themeShade="80"/>
-                <w:sz w:val="16"/>
-                <w:szCs w:val="16"/>
-              </w:rPr>
-              <w:t xml:space="preserve"> </w:t>
-            </w:r>
-            <w:r>
-              <w:rPr>
-                <w:rFonts w:ascii="Arial" w:eastAsia="Arial" w:hAnsi="Arial" w:cs="Arial"/>
-                <w:color w:val="525252" w:themeColor="accent3" w:themeShade="80"/>
-                <w:sz w:val="20"/>
-                <w:szCs w:val="20"/>
-              </w:rPr>
-              <w:t xml:space="preserve">Descrever o produto decorrente da atividade de Extensão. </w:t>
-            </w:r>
-          </w:p>
-          <w:p>
-            <w:pPr>
-              <w:shd w:val="clear" w:color="auto" w:fill="FFFFFF"/>
-              <w:rPr>
-                <w:rFonts w:ascii="Arial" w:eastAsia="Arial" w:hAnsi="Arial" w:cs="Arial"/>
-                <w:b/>
-                <w:sz w:val="20"/>
-                <w:szCs w:val="20"/>
-              </w:rPr>
-            </w:pPr>
-            <w:r>
-              <w:rPr>
-                <w:rFonts w:ascii="Arial" w:eastAsia="Arial" w:hAnsi="Arial" w:cs="Arial"/>
-                <w:color w:val="525252" w:themeColor="accent3" w:themeShade="80"/>
-                <w:sz w:val="20"/>
-                <w:szCs w:val="20"/>
-              </w:rPr>
-              <w:t>Apresentar evidências como fotos, links, folder, cartilha, código, apresentação, etc.</w:t>
+                <w:b/>
+                <w:sz w:val="20"/>
+                <w:szCs w:val="20"/>
+              </w:rPr>
+            </w:pPr>
+            <w:r>
+              <w:rPr>
+                <w:rFonts w:ascii="Arial" w:eastAsia="Arial" w:hAnsi="Arial" w:cs="Arial"/>
+                <w:color w:val="525252" w:themeColor="accent3" w:themeShade="80"/>
+                <w:sz w:val="20"/>
+                <w:szCs w:val="20"/>
+              </w:rPr>
+              <w:t>As evidências englobam o código-fonte documentado, a montagem física do sistema e os protótipos das interfaces digitais.</w:t>
             </w:r>
           </w:p>
         </w:tc>
       </w:tr>
     </w:tbl>
+    <w:p>
+      <w:pPr>
+        <w:spacing w:after="0" w:line="240" w:lineRule="auto"/>
+        <w:rPr>
+          <w:rFonts w:ascii="Arial" w:eastAsia="Arial" w:hAnsi="Arial" w:cs="Arial"/>
+          <w:b/>
+          <w:sz w:val="20"/>
+          <w:szCs w:val="20"/>
+        </w:rPr>
+      </w:pPr>
+    </w:p>
+    <w:p>
+      <w:pPr>
+        <w:spacing w:after="0" w:line="240" w:lineRule="auto"/>
+        <w:rPr>
+          <w:rFonts w:ascii="Arial" w:eastAsia="Arial" w:hAnsi="Arial" w:cs="Arial"/>
+          <w:b/>
+          <w:sz w:val="20"/>
+          <w:szCs w:val="20"/>
+        </w:rPr>
+      </w:pPr>
+    </w:p>
     <w:p>
       <w:pPr>
         <w:spacing w:after="0" w:line="240" w:lineRule="auto"/>
@@ -1374,7 +1528,6 @@
               <w:bottom w:val="single" w:sz="4" w:space="0" w:color="000000"/>
               <w:right w:val="single" w:sz="4" w:space="0" w:color="000000"/>
             </w:tcBorders>
-            <w:shd w:val="clear" w:color="auto" w:fill="auto"/>
           </w:tcPr>
           <w:p>
             <w:pPr>
@@ -1401,7 +1554,7 @@
                 <w:sz w:val="20"/>
                 <w:szCs w:val="20"/>
               </w:rPr>
-              <w:t xml:space="preserve">Inserir os dados neste espaço. Orientações: conhecer na prática a realidade do campo de atuação. Definir e descrever o local em que a intervenção prevista na atividade de extensão pode ser implementada, lembrando que não há obrigatoriedade de esta ação ser efetivamente colocada em prática neste momento. É importante considerar intervenções tecnicamente exequíveis, sustentáveis e economicamente viáveis. </w:t>
+              <w:t>A intervenção é executada em ambientes residenciais simulados através de uma maquete técnica de alta fidelidade que replica três setores independentes. Este cenário visa mitigar a problemática de quadros elétricos convencionais que carecem de monitoramento individualizado, o que mascara desperdícios e dificulta a prevenção de sobrecargas em instalações reais de baixa tensão.</w:t>
             </w:r>
           </w:p>
         </w:tc>
@@ -1458,7 +1611,6 @@
               <w:bottom w:val="single" w:sz="4" w:space="0" w:color="000000"/>
               <w:right w:val="single" w:sz="4" w:space="0" w:color="000000"/>
             </w:tcBorders>
-            <w:shd w:val="clear" w:color="auto" w:fill="auto"/>
           </w:tcPr>
           <w:p>
             <w:pPr>
@@ -1485,7 +1637,7 @@
                 <w:sz w:val="20"/>
                 <w:szCs w:val="20"/>
               </w:rPr>
-              <w:t xml:space="preserve">Inserir os dados neste espaço. Orientações: buscar conhecer na prática a realidade do campo de atuação para a intervenção extensionista. Definir os sujeitos que poderão ser impactados pela intervenção. Caracterizar o público-alvo, características socioeconômicas e educacionais ou outros dados considerados relevantes. Nesta etapa poderá ser realizado um levantamento diagnóstico da comunidade, os dados podem ser obtidos na prática com base na metodologia proposta para o projeto de extensão (visitas, entrevistas, questionários, reuniões, roda de conversa, ou uso de outras ferramentas de levantamento). Adequar a proposta de acordo com as especificidades do curso. Os dados aqui inseridos também podem ser empregados na concepção do projeto propriamente dito. </w:t>
+              <w:t>Consumidores residenciais e gestores de microempresas que buscam previsibilidade financeira e proteção patrimonial. O público apresenta uma carência de 100% em ferramentas de monitoramento ativo, dependendo de faturas mensais reativas para compreender seus gastos, o que limita qualquer capacidade de gestão preventiva.</w:t>
             </w:r>
           </w:p>
         </w:tc>
@@ -1541,7 +1693,6 @@
               <w:bottom w:val="single" w:sz="4" w:space="0" w:color="000000"/>
               <w:right w:val="single" w:sz="4" w:space="0" w:color="000000"/>
             </w:tcBorders>
-            <w:shd w:val="clear" w:color="auto" w:fill="auto"/>
           </w:tcPr>
           <w:p>
             <w:pPr>
@@ -1568,26 +1719,7 @@
                 <w:sz w:val="20"/>
                 <w:szCs w:val="20"/>
               </w:rPr>
-              <w:t>Inserir os dados neste espaço. Orientações:</w:t>
-            </w:r>
-            <w:r>
-              <w:rPr>
-                <w:rFonts w:ascii="Arial" w:eastAsia="Arial" w:hAnsi="Arial" w:cs="Arial"/>
-                <w:b/>
-                <w:color w:val="525252" w:themeColor="accent3" w:themeShade="80"/>
-                <w:sz w:val="16"/>
-                <w:szCs w:val="16"/>
-              </w:rPr>
-              <w:t xml:space="preserve"> </w:t>
-            </w:r>
-            <w:r>
-              <w:rPr>
-                <w:rFonts w:ascii="Arial" w:eastAsia="Arial" w:hAnsi="Arial" w:cs="Arial"/>
-                <w:color w:val="525252" w:themeColor="accent3" w:themeShade="80"/>
-                <w:sz w:val="20"/>
-                <w:szCs w:val="20"/>
-              </w:rPr>
-              <w:t xml:space="preserve">observar a realidade em si, identificar os postos-chave, os problemas apontados e suas características para que o plano de intervenção possa contribuir na transformação da realidade observada. Selecionar o problema que será objeto da intervenção e apresentar argumentos relativos à sua relevância de estudo. Os dados aqui inseridos também podem ser empregados na concepção do projeto propriamente dito. </w:t>
+              <w:t>O foco reside no "descontrole energético estrutural", definido pela invisibilidade do consumo em tempo real e pela ausência de dispositivos capazes de reagir autonomamente a sobrecargas. O objeto de estudo é a criação de um sistema de monitoramento segmentado que identifique anomalias e atue preventivamente no desligamento de cargas, visando extinguir focos de incêndio e desperdícios por equipamentos ineficientes.</w:t>
             </w:r>
           </w:p>
         </w:tc>
@@ -1643,7 +1775,6 @@
               <w:bottom w:val="single" w:sz="4" w:space="0" w:color="000000"/>
               <w:right w:val="single" w:sz="4" w:space="0" w:color="000000"/>
             </w:tcBorders>
-            <w:shd w:val="clear" w:color="auto" w:fill="auto"/>
           </w:tcPr>
           <w:p>
             <w:pPr>
@@ -1670,36 +1801,7 @@
                 <w:sz w:val="20"/>
                 <w:szCs w:val="20"/>
               </w:rPr>
-              <w:t>Inserir os dados neste espaço. Orientações:</w:t>
-            </w:r>
-            <w:r>
-              <w:rPr>
-                <w:rFonts w:ascii="Arial" w:eastAsia="Arial" w:hAnsi="Arial" w:cs="Arial"/>
-                <w:b/>
-                <w:color w:val="525252" w:themeColor="accent3" w:themeShade="80"/>
-                <w:sz w:val="16"/>
-                <w:szCs w:val="16"/>
-              </w:rPr>
-              <w:t xml:space="preserve"> </w:t>
-            </w:r>
-            <w:r>
-              <w:rPr>
-                <w:rFonts w:ascii="Arial" w:eastAsia="Arial" w:hAnsi="Arial" w:cs="Arial"/>
-                <w:color w:val="525252" w:themeColor="accent3" w:themeShade="80"/>
-                <w:sz w:val="20"/>
-                <w:szCs w:val="20"/>
-              </w:rPr>
-              <w:t>as hipóteses devem ser construídas após a teorização e estudo do problema observado. Relacionar hipóteses de intervenção para solução do problema de estudo e selecionar a mais adequada. É importante considerar intervenções tecnicamente exequíveis, sustentáveis e economicamente viáveis</w:t>
-            </w:r>
-            <w:r>
-              <w:rPr>
-                <w:rFonts w:ascii="Arial" w:eastAsia="Arial" w:hAnsi="Arial" w:cs="Arial"/>
-                <w:b/>
-                <w:color w:val="525252" w:themeColor="accent3" w:themeShade="80"/>
-                <w:sz w:val="16"/>
-                <w:szCs w:val="16"/>
-              </w:rPr>
-              <w:t>.</w:t>
+              <w:t>A hipótese central postula que a integração de uma interface móvel de fácil compreensão com um sistema de proteção automática de alta velocidade poderá reduzir o consumo elétrico em até 20%. A arquitetura híbrida Arduino-ESP32 é a chave para garantir que a proteção local seja imune a latências de rede, enquanto a integração em nuvem viabiliza o controle e a transparência remota.</w:t>
             </w:r>
           </w:p>
         </w:tc>
@@ -1748,71 +1850,6 @@
           <w:szCs w:val="20"/>
         </w:rPr>
       </w:pPr>
-    </w:p>
-    <w:p>
-      <w:pPr>
-        <w:spacing w:after="0" w:line="240" w:lineRule="auto"/>
-        <w:rPr>
-          <w:rFonts w:ascii="Arial" w:eastAsia="Arial" w:hAnsi="Arial" w:cs="Arial"/>
-          <w:b/>
-          <w:sz w:val="20"/>
-          <w:szCs w:val="20"/>
-        </w:rPr>
-      </w:pPr>
-    </w:p>
-    <w:p>
-      <w:pPr>
-        <w:spacing w:after="0" w:line="240" w:lineRule="auto"/>
-        <w:rPr>
-          <w:rFonts w:ascii="Arial" w:eastAsia="Arial" w:hAnsi="Arial" w:cs="Arial"/>
-          <w:b/>
-          <w:sz w:val="20"/>
-          <w:szCs w:val="20"/>
-        </w:rPr>
-      </w:pPr>
-    </w:p>
-    <w:p>
-      <w:pPr>
-        <w:spacing w:after="0" w:line="240" w:lineRule="auto"/>
-        <w:rPr>
-          <w:rFonts w:ascii="Arial" w:eastAsia="Arial" w:hAnsi="Arial" w:cs="Arial"/>
-          <w:b/>
-          <w:sz w:val="20"/>
-          <w:szCs w:val="20"/>
-        </w:rPr>
-      </w:pPr>
-    </w:p>
-    <w:p>
-      <w:pPr>
-        <w:spacing w:after="0" w:line="240" w:lineRule="auto"/>
-        <w:rPr>
-          <w:rFonts w:ascii="Arial" w:eastAsia="Arial" w:hAnsi="Arial" w:cs="Arial"/>
-          <w:b/>
-          <w:sz w:val="20"/>
-          <w:szCs w:val="20"/>
-        </w:rPr>
-      </w:pPr>
-    </w:p>
-    <w:p>
-      <w:pPr>
-        <w:spacing w:after="0" w:line="240" w:lineRule="auto"/>
-        <w:rPr>
-          <w:rFonts w:ascii="Arial" w:eastAsia="Arial" w:hAnsi="Arial" w:cs="Arial"/>
-          <w:b/>
-          <w:sz w:val="20"/>
-          <w:szCs w:val="20"/>
-        </w:rPr>
-      </w:pPr>
-    </w:p>
-    <w:p>
-      <w:pPr>
-        <w:spacing w:after="0" w:line="240" w:lineRule="auto"/>
-        <w:rPr>
-          <w:rFonts w:ascii="Arial" w:eastAsia="Arial" w:hAnsi="Arial" w:cs="Arial"/>
-          <w:sz w:val="20"/>
-          <w:szCs w:val="20"/>
-        </w:rPr>
-      </w:pPr>
       <w:r>
         <w:rPr>
           <w:rFonts w:ascii="Arial" w:eastAsia="Arial" w:hAnsi="Arial" w:cs="Arial"/>
@@ -1821,36 +1858,6 @@
           <w:szCs w:val="20"/>
         </w:rPr>
         <w:t>3 DESCRIÇÃO DO PROJETO</w:t>
-      </w:r>
-    </w:p>
-    <w:p>
-      <w:pPr>
-        <w:pBdr>
-          <w:top w:val="nil"/>
-          <w:left w:val="nil"/>
-          <w:bottom w:val="nil"/>
-          <w:right w:val="nil"/>
-          <w:between w:val="nil"/>
-        </w:pBdr>
-        <w:spacing w:after="0" w:line="240" w:lineRule="auto"/>
-        <w:jc w:val="both"/>
-        <w:rPr>
-          <w:rFonts w:ascii="Arial" w:eastAsia="Arial" w:hAnsi="Arial" w:cs="Arial"/>
-          <w:b/>
-          <w:color w:val="525252" w:themeColor="accent3" w:themeShade="80"/>
-          <w:sz w:val="16"/>
-          <w:szCs w:val="16"/>
-        </w:rPr>
-      </w:pPr>
-      <w:r>
-        <w:rPr>
-          <w:rFonts w:ascii="Arial" w:eastAsia="Arial" w:hAnsi="Arial" w:cs="Arial"/>
-          <w:b/>
-          <w:color w:val="525252" w:themeColor="accent3" w:themeShade="80"/>
-          <w:sz w:val="16"/>
-          <w:szCs w:val="16"/>
-        </w:rPr>
-        <w:t xml:space="preserve">É importante destacar que um projeto de extensão não precisa ser necessariamente igual a um projeto de pesquisa. Mesmo que haja necessidade de pesquisa prévia para a fundamentação teórica, construção da introdução e para um melhor entendimento sobre a realidade a ser trabalhada, é preciso que um projeto de extensão contemple práticas que promovam mudanças e/ou melhorias identificadas como necessárias. O projeto final deverá ser simples, objetivo, claro e ter de 3 a 5 páginas, dentro do modelo aqui proposto. </w:t>
       </w:r>
     </w:p>
     <w:p>
@@ -1902,7 +1909,6 @@
               <w:bottom w:val="single" w:sz="4" w:space="0" w:color="000000"/>
               <w:right w:val="single" w:sz="4" w:space="0" w:color="000000"/>
             </w:tcBorders>
-            <w:shd w:val="clear" w:color="auto" w:fill="auto"/>
           </w:tcPr>
           <w:p>
             <w:pPr>
@@ -1910,6 +1916,72 @@
               <w:jc w:val="both"/>
               <w:rPr>
                 <w:rFonts w:ascii="Arial" w:eastAsia="Arial" w:hAnsi="Arial" w:cs="Arial"/>
+                <w:color w:val="525252" w:themeColor="accent3" w:themeShade="80"/>
+                <w:sz w:val="20"/>
+                <w:szCs w:val="20"/>
+              </w:rPr>
+            </w:pPr>
+            <w:r>
+              <w:rPr>
+                <w:rFonts w:ascii="Arial" w:eastAsia="Arial" w:hAnsi="Arial" w:cs="Arial"/>
+                <w:color w:val="525252" w:themeColor="accent3" w:themeShade="80"/>
+                <w:sz w:val="20"/>
+                <w:szCs w:val="20"/>
+              </w:rPr>
+              <w:t xml:space="preserve">O Sistema Inteligente de Gestão de Energia (SIGE) propõe uma intervenção tecnológica robusta voltada ao monitoramento e otimização do consumo elétrico residencial e comercial. O projeto responde ao aumento de 12,3% no consumo nacional em 2024 e aos alarmantes índices de acidentes elétricos por sobrecarga. </w:t>
+            </w:r>
+          </w:p>
+          <w:p>
+            <w:pPr>
+              <w:spacing w:after="0" w:line="240" w:lineRule="auto"/>
+              <w:jc w:val="both"/>
+              <w:rPr>
+                <w:rFonts w:ascii="Arial" w:eastAsia="Arial" w:hAnsi="Arial" w:cs="Arial"/>
+                <w:color w:val="525252" w:themeColor="accent3" w:themeShade="80"/>
+                <w:sz w:val="20"/>
+                <w:szCs w:val="20"/>
+              </w:rPr>
+            </w:pPr>
+          </w:p>
+          <w:p>
+            <w:pPr>
+              <w:spacing w:after="0" w:line="240" w:lineRule="auto"/>
+              <w:jc w:val="both"/>
+              <w:rPr>
+                <w:rFonts w:ascii="Arial" w:eastAsia="Arial" w:hAnsi="Arial" w:cs="Arial"/>
+                <w:color w:val="525252" w:themeColor="accent3" w:themeShade="80"/>
+                <w:sz w:val="20"/>
+                <w:szCs w:val="20"/>
+              </w:rPr>
+            </w:pPr>
+            <w:r>
+              <w:rPr>
+                <w:rFonts w:ascii="Arial" w:eastAsia="Arial" w:hAnsi="Arial" w:cs="Arial"/>
+                <w:color w:val="525252" w:themeColor="accent3" w:themeShade="80"/>
+                <w:sz w:val="20"/>
+                <w:szCs w:val="20"/>
+              </w:rPr>
+              <w:t xml:space="preserve">A solução preenche a lacuna de transparência nos dados energéticos através de um ecossistema de Internet das Coisas (IoT) com arquitetura híbrida. Utiliza-se um Arduino para o processamento analógico de sensores ACS712 e um módulo ESP32 dedicado à comunicação sem fio via protocolo MQTT. O sistema físico monitora três circuitos independentes, sinalizando estados de carga via LEDs e operando o desligamento de segurança via relés SSR40DA. </w:t>
+            </w:r>
+          </w:p>
+          <w:p>
+            <w:pPr>
+              <w:spacing w:after="0" w:line="240" w:lineRule="auto"/>
+              <w:jc w:val="both"/>
+              <w:rPr>
+                <w:rFonts w:ascii="Arial" w:eastAsia="Arial" w:hAnsi="Arial" w:cs="Arial"/>
+                <w:color w:val="525252" w:themeColor="accent3" w:themeShade="80"/>
+                <w:sz w:val="20"/>
+                <w:szCs w:val="20"/>
+              </w:rPr>
+            </w:pPr>
+          </w:p>
+          <w:p>
+            <w:pPr>
+              <w:spacing w:after="0" w:line="240" w:lineRule="auto"/>
+              <w:jc w:val="both"/>
+              <w:rPr>
+                <w:rFonts w:ascii="Arial" w:eastAsia="Arial" w:hAnsi="Arial" w:cs="Arial"/>
                 <w:color w:val="000000"/>
                 <w:sz w:val="20"/>
                 <w:szCs w:val="20"/>
@@ -1922,26 +1994,7 @@
                 <w:sz w:val="20"/>
                 <w:szCs w:val="20"/>
               </w:rPr>
-              <w:t>Inserir os dados neste espaço. Orientações:</w:t>
-            </w:r>
-            <w:r>
-              <w:rPr>
-                <w:rFonts w:ascii="Arial" w:eastAsia="Arial" w:hAnsi="Arial" w:cs="Arial"/>
-                <w:b/>
-                <w:color w:val="525252" w:themeColor="accent3" w:themeShade="80"/>
-                <w:sz w:val="16"/>
-                <w:szCs w:val="16"/>
-              </w:rPr>
-              <w:t xml:space="preserve"> </w:t>
-            </w:r>
-            <w:r>
-              <w:rPr>
-                <w:rFonts w:ascii="Arial" w:eastAsia="Arial" w:hAnsi="Arial" w:cs="Arial"/>
-                <w:color w:val="525252" w:themeColor="accent3" w:themeShade="80"/>
-                <w:sz w:val="20"/>
-                <w:szCs w:val="20"/>
-              </w:rPr>
-              <w:t xml:space="preserve">texto sem parágrafos. Trata-se de um resumo, apresentado de forma sintética, clara, objetiva e concisa, dos pontos mais importantes da proposta do projeto: breve descrição do estudo, o problema a ser focado, público-alvo ou comunidade que será envolvido na ação extensionista, o objetivo geral da ação extensionista, as metodologias a serem utilizadas, as atividades previstas, os resultados esperados, e outras informações que forem consideradas relevantes. Escrever um texto curto. </w:t>
+              <w:t>O ecossistema é complementado por um aplicativo móvel para o cliente e um portal web administrativo para análise profunda de métricas. Os resultados projetados incluem a mitigação de riscos em tempo inferior a um segundo e a democratização tecnológica para promover a eficiência energética e a segurança na comunidade.</w:t>
             </w:r>
           </w:p>
         </w:tc>
@@ -1976,6 +2029,7 @@
           <w:sz w:val="20"/>
           <w:szCs w:val="20"/>
         </w:rPr>
+        <w:lastRenderedPageBreak/>
         <w:t>Introdução</w:t>
       </w:r>
     </w:p>
@@ -1998,7 +2052,6 @@
               <w:bottom w:val="single" w:sz="4" w:space="0" w:color="000000"/>
               <w:right w:val="single" w:sz="4" w:space="0" w:color="000000"/>
             </w:tcBorders>
-            <w:shd w:val="clear" w:color="auto" w:fill="auto"/>
           </w:tcPr>
           <w:p>
             <w:pPr>
@@ -2006,65 +2059,84 @@
               <w:jc w:val="both"/>
               <w:rPr>
                 <w:rFonts w:ascii="Arial" w:eastAsia="Arial" w:hAnsi="Arial" w:cs="Arial"/>
-                <w:sz w:val="20"/>
-                <w:szCs w:val="20"/>
-              </w:rPr>
-            </w:pPr>
-            <w:r>
-              <w:rPr>
-                <w:rFonts w:ascii="Arial" w:eastAsia="Arial" w:hAnsi="Arial" w:cs="Arial"/>
-                <w:color w:val="525252" w:themeColor="accent3" w:themeShade="80"/>
-                <w:sz w:val="20"/>
-                <w:szCs w:val="20"/>
-              </w:rPr>
-              <w:t>Inserir os dados neste espaço. Orientações:</w:t>
-            </w:r>
-            <w:r>
-              <w:rPr>
-                <w:rFonts w:ascii="Arial" w:eastAsia="Arial" w:hAnsi="Arial" w:cs="Arial"/>
-                <w:b/>
-                <w:color w:val="525252" w:themeColor="accent3" w:themeShade="80"/>
-                <w:sz w:val="16"/>
-                <w:szCs w:val="16"/>
-              </w:rPr>
-              <w:t xml:space="preserve"> </w:t>
-            </w:r>
-            <w:r>
-              <w:rPr>
-                <w:rFonts w:ascii="Arial" w:eastAsia="Arial" w:hAnsi="Arial" w:cs="Arial"/>
-                <w:color w:val="525252" w:themeColor="accent3" w:themeShade="80"/>
-                <w:sz w:val="20"/>
-                <w:szCs w:val="20"/>
-              </w:rPr>
-              <w:t xml:space="preserve">apresentar a introdução com base na fundamentação teórica sobre o tema trabalhado e que situe o objeto da intervenção, afirmando sua relevância. </w:t>
-            </w:r>
-            <w:r>
-              <w:rPr>
-                <w:rFonts w:ascii="Arial" w:eastAsia="Arial" w:hAnsi="Arial" w:cs="Arial"/>
-                <w:color w:val="525252" w:themeColor="accent3" w:themeShade="80"/>
-                <w:sz w:val="20"/>
-                <w:szCs w:val="20"/>
-              </w:rPr>
-              <w:lastRenderedPageBreak/>
-              <w:t>Descrever as áreas e ODS impactados, incluir o referencial teórico, usar referências segundo ABNT. Não se trata de uma monografia e sim de uma atividade de extensão, por isso a introdução deve ser clara, objetiva</w:t>
-            </w:r>
-            <w:r>
-              <w:rPr>
-                <w:rFonts w:ascii="Arial" w:eastAsia="Arial" w:hAnsi="Arial" w:cs="Arial"/>
-                <w:color w:val="525252" w:themeColor="accent3" w:themeShade="80"/>
-                <w:sz w:val="20"/>
-                <w:szCs w:val="20"/>
-              </w:rPr>
-              <w:t xml:space="preserve"> </w:t>
-            </w:r>
-            <w:r>
-              <w:rPr>
-                <w:rFonts w:ascii="Arial" w:eastAsia="Arial" w:hAnsi="Arial" w:cs="Arial"/>
-                <w:color w:val="525252" w:themeColor="accent3" w:themeShade="80"/>
-                <w:sz w:val="20"/>
-                <w:szCs w:val="20"/>
-              </w:rPr>
-              <w:t xml:space="preserve">e sintética. </w:t>
+                <w:color w:val="525252" w:themeColor="accent3" w:themeShade="80"/>
+                <w:sz w:val="20"/>
+                <w:szCs w:val="20"/>
+              </w:rPr>
+            </w:pPr>
+            <w:r>
+              <w:rPr>
+                <w:rFonts w:ascii="Arial" w:eastAsia="Arial" w:hAnsi="Arial" w:cs="Arial"/>
+                <w:color w:val="525252" w:themeColor="accent3" w:themeShade="80"/>
+                <w:sz w:val="20"/>
+                <w:szCs w:val="20"/>
+              </w:rPr>
+              <w:t xml:space="preserve">O cenário energético brasileiro atual é marcado por um crescimento acelerado da demanda residencial, que atingiu níveis recordes em 2024. Este fenômeno, aliado à complexidade tarifária, sobrecarrega o orçamento das famílias e a operação de pequenos negócios. Paralelamente, a falta de monitoramento reflete em dados críticos de segurança: incêndios por sobrecarga em residências representam a maioria das fatalidades em acidentes elétricos no país. </w:t>
+            </w:r>
+          </w:p>
+          <w:p>
+            <w:pPr>
+              <w:spacing w:after="0" w:line="240" w:lineRule="auto"/>
+              <w:jc w:val="both"/>
+              <w:rPr>
+                <w:rFonts w:ascii="Arial" w:eastAsia="Arial" w:hAnsi="Arial" w:cs="Arial"/>
+                <w:color w:val="525252" w:themeColor="accent3" w:themeShade="80"/>
+                <w:sz w:val="20"/>
+                <w:szCs w:val="20"/>
+              </w:rPr>
+            </w:pPr>
+          </w:p>
+          <w:p>
+            <w:pPr>
+              <w:spacing w:after="0" w:line="240" w:lineRule="auto"/>
+              <w:jc w:val="both"/>
+              <w:rPr>
+                <w:rFonts w:ascii="Arial" w:eastAsia="Arial" w:hAnsi="Arial" w:cs="Arial"/>
+                <w:color w:val="525252" w:themeColor="accent3" w:themeShade="80"/>
+                <w:sz w:val="20"/>
+                <w:szCs w:val="20"/>
+              </w:rPr>
+            </w:pPr>
+            <w:r>
+              <w:rPr>
+                <w:rFonts w:ascii="Arial" w:eastAsia="Arial" w:hAnsi="Arial" w:cs="Arial"/>
+                <w:color w:val="525252" w:themeColor="accent3" w:themeShade="80"/>
+                <w:sz w:val="20"/>
+                <w:szCs w:val="20"/>
+              </w:rPr>
+              <w:t xml:space="preserve">Diante desta urgência, o SIGE surge fundamentado nos preceitos da IoT, integrando sensores de efeito Hall e relés de estado sólido para uma atuação ágil sobre os circuitos. A inovação estrutural reside na segmentação de tarefas: o Arduino UNO atua como unidade de aplicação (lógica e sensores), enquanto o ESP32 gerencia exclusivamente a comunicação. </w:t>
+            </w:r>
+          </w:p>
+          <w:p>
+            <w:pPr>
+              <w:spacing w:after="0" w:line="240" w:lineRule="auto"/>
+              <w:jc w:val="both"/>
+              <w:rPr>
+                <w:rFonts w:ascii="Arial" w:eastAsia="Arial" w:hAnsi="Arial" w:cs="Arial"/>
+                <w:color w:val="525252" w:themeColor="accent3" w:themeShade="80"/>
+                <w:sz w:val="20"/>
+                <w:szCs w:val="20"/>
+              </w:rPr>
+            </w:pPr>
+          </w:p>
+          <w:p>
+            <w:pPr>
+              <w:spacing w:after="0" w:line="240" w:lineRule="auto"/>
+              <w:jc w:val="both"/>
+              <w:rPr>
+                <w:rFonts w:ascii="Arial" w:eastAsia="Arial" w:hAnsi="Arial" w:cs="Arial"/>
+                <w:sz w:val="20"/>
+                <w:szCs w:val="20"/>
+              </w:rPr>
+            </w:pPr>
+            <w:r>
+              <w:rPr>
+                <w:rFonts w:ascii="Arial" w:eastAsia="Arial" w:hAnsi="Arial" w:cs="Arial"/>
+                <w:color w:val="525252" w:themeColor="accent3" w:themeShade="80"/>
+                <w:sz w:val="20"/>
+                <w:szCs w:val="20"/>
+              </w:rPr>
+              <w:t>Esta separação evita que oscilações de rede interfiram na proteção local. O tráfego de dados via MQTT possibilita a integração entre hardware, aplicativo e portal web, posicionando o SIGE como uma ferramenta de gestão ativa e transformação social.</w:t>
             </w:r>
           </w:p>
         </w:tc>
@@ -2120,49 +2192,68 @@
               <w:bottom w:val="single" w:sz="4" w:space="0" w:color="000000"/>
               <w:right w:val="single" w:sz="4" w:space="0" w:color="000000"/>
             </w:tcBorders>
-            <w:shd w:val="clear" w:color="auto" w:fill="auto"/>
           </w:tcPr>
           <w:p>
             <w:pPr>
               <w:tabs>
                 <w:tab w:val="left" w:pos="360"/>
               </w:tabs>
-              <w:spacing w:after="0" w:line="240" w:lineRule="auto"/>
+              <w:spacing w:after="0"/>
               <w:jc w:val="both"/>
               <w:rPr>
                 <w:rFonts w:ascii="Arial" w:eastAsia="Arial" w:hAnsi="Arial" w:cs="Arial"/>
-                <w:color w:val="FF3333"/>
-                <w:sz w:val="20"/>
-                <w:szCs w:val="20"/>
-              </w:rPr>
-            </w:pPr>
-            <w:r>
-              <w:rPr>
-                <w:rFonts w:ascii="Arial" w:eastAsia="Arial" w:hAnsi="Arial" w:cs="Arial"/>
-                <w:color w:val="525252" w:themeColor="accent3" w:themeShade="80"/>
-                <w:sz w:val="20"/>
-                <w:szCs w:val="20"/>
-              </w:rPr>
-              <w:t>Inserir os dados neste espaço. Orientações:</w:t>
-            </w:r>
-            <w:r>
-              <w:rPr>
-                <w:rFonts w:ascii="Arial" w:eastAsia="Arial" w:hAnsi="Arial" w:cs="Arial"/>
-                <w:b/>
-                <w:color w:val="525252" w:themeColor="accent3" w:themeShade="80"/>
-                <w:sz w:val="16"/>
-                <w:szCs w:val="16"/>
-              </w:rPr>
-              <w:t xml:space="preserve"> </w:t>
-            </w:r>
-            <w:r>
-              <w:rPr>
-                <w:rFonts w:ascii="Arial" w:eastAsia="Arial" w:hAnsi="Arial" w:cs="Arial"/>
-                <w:color w:val="525252" w:themeColor="accent3" w:themeShade="80"/>
-                <w:sz w:val="20"/>
-                <w:szCs w:val="20"/>
-              </w:rPr>
-              <w:t>Descrever os objetivos de forma clara. Cada objetivo deve ter uma correspondência com os resultados esperados. Devem ser expressos sucintamente, em itens, iniciando a frase com verbo de ação e não em forma de relatos.</w:t>
+                <w:color w:val="525252" w:themeColor="accent3" w:themeShade="80"/>
+                <w:sz w:val="20"/>
+                <w:szCs w:val="20"/>
+              </w:rPr>
+            </w:pPr>
+            <w:r>
+              <w:rPr>
+                <w:rFonts w:ascii="Arial" w:eastAsia="Arial" w:hAnsi="Arial" w:cs="Arial"/>
+                <w:color w:val="525252" w:themeColor="accent3" w:themeShade="80"/>
+                <w:sz w:val="20"/>
+                <w:szCs w:val="20"/>
+              </w:rPr>
+              <w:t xml:space="preserve">O propósito central é o estabelecimento de uma infraestrutura técnica para o monitoramento contínuo da corrente RMS em três circuitos físicos independentes. O sistema visa promover a segurança ativa ao alertar o usuário através de um aplicativo móvel sobre quaisquer anomalias que excedam os limites configurados. </w:t>
+            </w:r>
+          </w:p>
+          <w:p>
+            <w:pPr>
+              <w:tabs>
+                <w:tab w:val="left" w:pos="360"/>
+              </w:tabs>
+              <w:spacing w:after="0"/>
+              <w:jc w:val="both"/>
+              <w:rPr>
+                <w:rFonts w:ascii="Arial" w:eastAsia="Arial" w:hAnsi="Arial" w:cs="Arial"/>
+                <w:color w:val="525252" w:themeColor="accent3" w:themeShade="80"/>
+                <w:sz w:val="20"/>
+                <w:szCs w:val="20"/>
+              </w:rPr>
+            </w:pPr>
+          </w:p>
+          <w:p>
+            <w:pPr>
+              <w:tabs>
+                <w:tab w:val="left" w:pos="360"/>
+              </w:tabs>
+              <w:spacing w:after="0"/>
+              <w:jc w:val="both"/>
+              <w:rPr>
+                <w:rFonts w:ascii="Arial" w:eastAsia="Arial" w:hAnsi="Arial" w:cs="Arial"/>
+                <w:color w:val="525252" w:themeColor="accent3" w:themeShade="80"/>
+                <w:sz w:val="20"/>
+                <w:szCs w:val="20"/>
+              </w:rPr>
+            </w:pPr>
+            <w:r>
+              <w:rPr>
+                <w:rFonts w:ascii="Arial" w:eastAsia="Arial" w:hAnsi="Arial" w:cs="Arial"/>
+                <w:color w:val="525252" w:themeColor="accent3" w:themeShade="80"/>
+                <w:sz w:val="20"/>
+                <w:szCs w:val="20"/>
+              </w:rPr>
+              <w:t>No âmbito patrimonial, objetiva-se a interrupção automática do fluxo elétrico em situações de risco crítico via relés SSR, minimizando danos e riscos de incêndio. Por fim, o projeto entrega um portal web administrativo para análise de métricas históricas, permitindo que o gestor tome decisões baseadas em dados reais para otimização de custos e eficiência energética.</w:t>
             </w:r>
           </w:p>
         </w:tc>
@@ -2216,7 +2307,6 @@
               <w:bottom w:val="single" w:sz="4" w:space="0" w:color="000000"/>
               <w:right w:val="single" w:sz="4" w:space="0" w:color="000000"/>
             </w:tcBorders>
-            <w:shd w:val="clear" w:color="auto" w:fill="auto"/>
           </w:tcPr>
           <w:p>
             <w:pPr>
@@ -2224,37 +2314,71 @@
               <w:jc w:val="both"/>
               <w:rPr>
                 <w:rFonts w:ascii="Arial" w:eastAsia="Arial" w:hAnsi="Arial" w:cs="Arial"/>
-                <w:sz w:val="20"/>
-                <w:szCs w:val="20"/>
-              </w:rPr>
-            </w:pPr>
-            <w:r>
-              <w:rPr>
-                <w:rFonts w:ascii="Arial" w:eastAsia="Arial" w:hAnsi="Arial" w:cs="Arial"/>
-                <w:color w:val="525252" w:themeColor="accent3" w:themeShade="80"/>
-                <w:sz w:val="20"/>
-                <w:szCs w:val="20"/>
-              </w:rPr>
-              <w:t>Inserir os dados neste espaço. Orientações:</w:t>
-            </w:r>
-            <w:r>
-              <w:rPr>
-                <w:rFonts w:ascii="Arial" w:eastAsia="Arial" w:hAnsi="Arial" w:cs="Arial"/>
-                <w:b/>
-                <w:color w:val="525252" w:themeColor="accent3" w:themeShade="80"/>
-                <w:sz w:val="16"/>
-                <w:szCs w:val="16"/>
-              </w:rPr>
-              <w:t xml:space="preserve"> </w:t>
-            </w:r>
-            <w:r>
-              <w:rPr>
-                <w:rFonts w:ascii="Arial" w:eastAsia="Arial" w:hAnsi="Arial" w:cs="Arial"/>
-                <w:color w:val="525252" w:themeColor="accent3" w:themeShade="80"/>
-                <w:sz w:val="20"/>
-                <w:szCs w:val="20"/>
-              </w:rPr>
-              <w:t xml:space="preserve">descrever como ocorrerá a ação extensionista junto ao público-alvo. Trata-se descrição sobre como será realizada a prática da ação extensionista, é o detalhamento do caminho a ser percorrido pela equipe em sua interação com a sociedade. Descrever os métodos, técnicas e estratégias para a implementação das atividades de intervenção previstas no projeto e sua contribuição para o alcance dos objetivos. Descrever o local, público-alvo, ferramentas empregadas para a relação dialógica com a comunidade ou setores da sociedade: visitas, entrevistas, questionários, reuniões, roda de conversa, ou uso de outras ferramentas de levantamento. Detalhar os procedimentos e as atividades a serem implementadas. </w:t>
+                <w:color w:val="525252" w:themeColor="accent3" w:themeShade="80"/>
+                <w:sz w:val="20"/>
+                <w:szCs w:val="20"/>
+              </w:rPr>
+            </w:pPr>
+            <w:r>
+              <w:rPr>
+                <w:rFonts w:ascii="Arial" w:eastAsia="Arial" w:hAnsi="Arial" w:cs="Arial"/>
+                <w:color w:val="525252" w:themeColor="accent3" w:themeShade="80"/>
+                <w:sz w:val="20"/>
+                <w:szCs w:val="20"/>
+              </w:rPr>
+              <w:t xml:space="preserve">A metodologia baseia-se na montagem de um protótipo físico integrado a uma infraestrutura de nuvem. O fluxo inicia no sensoriamento, onde sensores ACS712 captam variações de corrente processadas pelo Arduino, que executa cálculos de valor eficaz e a lógica de proteção local. A camada de conectividade utiliza o ESP32 como gateway para publicação de dados em formato JSON via MQTT. </w:t>
+            </w:r>
+          </w:p>
+          <w:p>
+            <w:pPr>
+              <w:spacing w:after="0" w:line="240" w:lineRule="auto"/>
+              <w:jc w:val="both"/>
+              <w:rPr>
+                <w:rFonts w:ascii="Arial" w:eastAsia="Arial" w:hAnsi="Arial" w:cs="Arial"/>
+                <w:color w:val="525252" w:themeColor="accent3" w:themeShade="80"/>
+                <w:sz w:val="20"/>
+                <w:szCs w:val="20"/>
+              </w:rPr>
+            </w:pPr>
+          </w:p>
+          <w:p>
+            <w:pPr>
+              <w:spacing w:after="0" w:line="240" w:lineRule="auto"/>
+              <w:jc w:val="both"/>
+              <w:rPr>
+                <w:rFonts w:ascii="Arial" w:eastAsia="Arial" w:hAnsi="Arial" w:cs="Arial"/>
+                <w:sz w:val="20"/>
+                <w:szCs w:val="20"/>
+              </w:rPr>
+            </w:pPr>
+            <w:r>
+              <w:rPr>
+                <w:rFonts w:ascii="Arial" w:eastAsia="Arial" w:hAnsi="Arial" w:cs="Arial"/>
+                <w:color w:val="525252" w:themeColor="accent3" w:themeShade="80"/>
+                <w:sz w:val="20"/>
+                <w:szCs w:val="20"/>
+              </w:rPr>
+              <w:t xml:space="preserve">A relação dialógica é estabelecida por interfaces digitais: o aplicativo fornece feedbacks e orientações </w:t>
+            </w:r>
+            <w:proofErr w:type="spellStart"/>
+            <w:r>
+              <w:rPr>
+                <w:rFonts w:ascii="Arial" w:eastAsia="Arial" w:hAnsi="Arial" w:cs="Arial"/>
+                <w:color w:val="525252" w:themeColor="accent3" w:themeShade="80"/>
+                <w:sz w:val="20"/>
+                <w:szCs w:val="20"/>
+              </w:rPr>
+              <w:t>push</w:t>
+            </w:r>
+            <w:proofErr w:type="spellEnd"/>
+            <w:r>
+              <w:rPr>
+                <w:rFonts w:ascii="Arial" w:eastAsia="Arial" w:hAnsi="Arial" w:cs="Arial"/>
+                <w:color w:val="525252" w:themeColor="accent3" w:themeShade="80"/>
+                <w:sz w:val="20"/>
+                <w:szCs w:val="20"/>
+              </w:rPr>
+              <w:t xml:space="preserve"> ao usuário, enquanto o portal web oferece ferramentas de auditoria. Esta abordagem traduz o conhecimento técnico em orientações práticas, promovendo uma mudança na percepção social sobre o uso da energia.</w:t>
             </w:r>
           </w:p>
         </w:tc>
@@ -2309,7 +2433,6 @@
               <w:bottom w:val="single" w:sz="4" w:space="0" w:color="000000"/>
               <w:right w:val="single" w:sz="4" w:space="0" w:color="000000"/>
             </w:tcBorders>
-            <w:shd w:val="clear" w:color="auto" w:fill="auto"/>
           </w:tcPr>
           <w:p>
             <w:pPr>
@@ -2317,18 +2440,51 @@
               <w:jc w:val="both"/>
               <w:rPr>
                 <w:rFonts w:ascii="Arial" w:eastAsia="Arial" w:hAnsi="Arial" w:cs="Arial"/>
-                <w:sz w:val="20"/>
-                <w:szCs w:val="20"/>
-              </w:rPr>
-            </w:pPr>
-            <w:r>
-              <w:rPr>
-                <w:rFonts w:ascii="Arial" w:eastAsia="Arial" w:hAnsi="Arial" w:cs="Arial"/>
-                <w:color w:val="525252" w:themeColor="accent3" w:themeShade="80"/>
-                <w:sz w:val="20"/>
-                <w:szCs w:val="20"/>
-              </w:rPr>
-              <w:t xml:space="preserve">Inserir os dados neste espaço. Orientações: este item pode ser apresentado como resultados parciais, ou resultados finais para projetos implementados, ou, ainda, resultados esperados para propostas de projetos. Descrever de forma objetiva de que modo o projeto espera modificar as condições inicialmente diagnosticadas no público-alvo envolvido. Trata-se de uma projeção dos impactos sociais esperados ou desejados, considerando que a extensão universitária busca estar atenta aos interesses e necessidades da maioria da população, buscando superar desigualdades, garantir diversidade, evitar exclusões, implementar o desenvolvimento regional e desenvolver políticas públicas. </w:t>
+                <w:color w:val="525252" w:themeColor="accent3" w:themeShade="80"/>
+                <w:sz w:val="20"/>
+                <w:szCs w:val="20"/>
+              </w:rPr>
+            </w:pPr>
+            <w:r>
+              <w:rPr>
+                <w:rFonts w:ascii="Arial" w:eastAsia="Arial" w:hAnsi="Arial" w:cs="Arial"/>
+                <w:color w:val="525252" w:themeColor="accent3" w:themeShade="80"/>
+                <w:sz w:val="20"/>
+                <w:szCs w:val="20"/>
+              </w:rPr>
+              <w:t xml:space="preserve">Os resultados projetados para esta intervenção compreendem a capacidade do usuário de identificar, de forma autônoma e precisa, quais equipamentos ou hábitos são responsáveis por picos de consumo, utilizando para isso as métricas consolidadas no portal web administrativo. Espera-se que essa visibilidade resulte em uma economia real na fatura mensal, estimada entre 10% e 20%, conforme padrões observados em sistemas semelhantes de gestão ativa. </w:t>
+            </w:r>
+          </w:p>
+          <w:p>
+            <w:pPr>
+              <w:spacing w:after="0" w:line="240" w:lineRule="auto"/>
+              <w:jc w:val="both"/>
+              <w:rPr>
+                <w:rFonts w:ascii="Arial" w:eastAsia="Arial" w:hAnsi="Arial" w:cs="Arial"/>
+                <w:color w:val="525252" w:themeColor="accent3" w:themeShade="80"/>
+                <w:sz w:val="20"/>
+                <w:szCs w:val="20"/>
+              </w:rPr>
+            </w:pPr>
+          </w:p>
+          <w:p>
+            <w:pPr>
+              <w:spacing w:after="0" w:line="240" w:lineRule="auto"/>
+              <w:jc w:val="both"/>
+              <w:rPr>
+                <w:rFonts w:ascii="Arial" w:eastAsia="Arial" w:hAnsi="Arial" w:cs="Arial"/>
+                <w:sz w:val="20"/>
+                <w:szCs w:val="20"/>
+              </w:rPr>
+            </w:pPr>
+            <w:r>
+              <w:rPr>
+                <w:rFonts w:ascii="Arial" w:eastAsia="Arial" w:hAnsi="Arial" w:cs="Arial"/>
+                <w:color w:val="525252" w:themeColor="accent3" w:themeShade="80"/>
+                <w:sz w:val="20"/>
+                <w:szCs w:val="20"/>
+              </w:rPr>
+              <w:t>No que tange à segurança, o impacto pretendido é a mitigação crítica de incêndios e danos elétricos, com o sistema apresentando uma taxa de resposta inferior a um segundo entre a detecção de uma sobrecarga e a atuação do relé de proteção. Dessa forma, o projeto espera entregar não apenas uma redução de custos, mas uma garantia tangível da integridade física das pessoas e da conservação do patrimônio dentro do ambiente monitorado.</w:t>
             </w:r>
           </w:p>
         </w:tc>
@@ -2383,7 +2539,6 @@
               <w:bottom w:val="single" w:sz="4" w:space="0" w:color="000000"/>
               <w:right w:val="single" w:sz="4" w:space="0" w:color="000000"/>
             </w:tcBorders>
-            <w:shd w:val="clear" w:color="auto" w:fill="auto"/>
           </w:tcPr>
           <w:p>
             <w:pPr>
@@ -2394,6 +2549,45 @@
               <w:jc w:val="both"/>
               <w:rPr>
                 <w:rFonts w:ascii="Arial" w:eastAsia="Arial" w:hAnsi="Arial" w:cs="Arial"/>
+                <w:color w:val="525252" w:themeColor="accent3" w:themeShade="80"/>
+                <w:sz w:val="20"/>
+                <w:szCs w:val="20"/>
+              </w:rPr>
+            </w:pPr>
+            <w:r>
+              <w:rPr>
+                <w:rFonts w:ascii="Arial" w:eastAsia="Arial" w:hAnsi="Arial" w:cs="Arial"/>
+                <w:color w:val="525252" w:themeColor="accent3" w:themeShade="80"/>
+                <w:sz w:val="20"/>
+                <w:szCs w:val="20"/>
+              </w:rPr>
+              <w:t xml:space="preserve">O SIGE demonstra o potencial da Ciência da Computação em conceber soluções de baixo custo para problemas históricos de infraestrutura. Ao integrar hardware acessível a plataformas digitais modernas, o projeto cumpre sua função extensionista ao transpor o conhecimento acadêmico para o cotidiano. </w:t>
+            </w:r>
+          </w:p>
+          <w:p>
+            <w:pPr>
+              <w:tabs>
+                <w:tab w:val="left" w:pos="360"/>
+              </w:tabs>
+              <w:spacing w:after="0" w:line="240" w:lineRule="auto"/>
+              <w:jc w:val="both"/>
+              <w:rPr>
+                <w:rFonts w:ascii="Arial" w:eastAsia="Arial" w:hAnsi="Arial" w:cs="Arial"/>
+                <w:color w:val="525252" w:themeColor="accent3" w:themeShade="80"/>
+                <w:sz w:val="20"/>
+                <w:szCs w:val="20"/>
+              </w:rPr>
+            </w:pPr>
+          </w:p>
+          <w:p>
+            <w:pPr>
+              <w:tabs>
+                <w:tab w:val="left" w:pos="360"/>
+              </w:tabs>
+              <w:spacing w:after="0" w:line="240" w:lineRule="auto"/>
+              <w:jc w:val="both"/>
+              <w:rPr>
+                <w:rFonts w:ascii="Arial" w:eastAsia="Arial" w:hAnsi="Arial" w:cs="Arial"/>
                 <w:color w:val="FF3333"/>
                 <w:sz w:val="20"/>
                 <w:szCs w:val="20"/>
@@ -2406,26 +2600,8 @@
                 <w:sz w:val="20"/>
                 <w:szCs w:val="20"/>
               </w:rPr>
-              <w:t>Inserir os dados neste espaço. Orientações:</w:t>
-            </w:r>
-            <w:r>
-              <w:rPr>
-                <w:rFonts w:ascii="Arial" w:eastAsia="Arial" w:hAnsi="Arial" w:cs="Arial"/>
-                <w:b/>
-                <w:color w:val="525252" w:themeColor="accent3" w:themeShade="80"/>
-                <w:sz w:val="16"/>
-                <w:szCs w:val="16"/>
-              </w:rPr>
-              <w:t xml:space="preserve"> </w:t>
-            </w:r>
-            <w:r>
-              <w:rPr>
-                <w:rFonts w:ascii="Arial" w:eastAsia="Arial" w:hAnsi="Arial" w:cs="Arial"/>
-                <w:color w:val="525252" w:themeColor="accent3" w:themeShade="80"/>
-                <w:sz w:val="20"/>
-                <w:szCs w:val="20"/>
-              </w:rPr>
-              <w:t>é o desfecho do projeto devendo responder o problema central do trabalho e destacar se o trabalho atendeu aos objetivos propostos, destacando os principais pontos e direções para futuras ações.</w:t>
+              <w:lastRenderedPageBreak/>
+              <w:t>Conclui-se que a transparência de dados é fundamental para a sustentabilidade e segurança, consolidando o SIGE como um modelo escalável de intervenção comunitária.</w:t>
             </w:r>
           </w:p>
         </w:tc>
@@ -2480,26 +2656,167 @@
               <w:bottom w:val="single" w:sz="4" w:space="0" w:color="000000"/>
               <w:right w:val="single" w:sz="4" w:space="0" w:color="000000"/>
             </w:tcBorders>
-            <w:shd w:val="clear" w:color="auto" w:fill="auto"/>
           </w:tcPr>
           <w:p>
             <w:pPr>
               <w:spacing w:after="0" w:line="240" w:lineRule="auto"/>
               <w:rPr>
                 <w:rFonts w:ascii="Arial" w:eastAsia="Arial" w:hAnsi="Arial" w:cs="Arial"/>
+                <w:color w:val="525252" w:themeColor="accent3" w:themeShade="80"/>
+                <w:sz w:val="20"/>
+                <w:szCs w:val="20"/>
+              </w:rPr>
+            </w:pPr>
+            <w:r>
+              <w:rPr>
+                <w:rFonts w:ascii="Arial" w:eastAsia="Arial" w:hAnsi="Arial" w:cs="Arial"/>
+                <w:color w:val="525252" w:themeColor="accent3" w:themeShade="80"/>
+                <w:sz w:val="20"/>
+                <w:szCs w:val="20"/>
+              </w:rPr>
+              <w:t xml:space="preserve">ABRACOPEL. Anuário Estatístico de Acidentes de Origem Elétrica 2024 (Ano-base 2023). São Paulo: </w:t>
+            </w:r>
+            <w:proofErr w:type="spellStart"/>
+            <w:r>
+              <w:rPr>
+                <w:rFonts w:ascii="Arial" w:eastAsia="Arial" w:hAnsi="Arial" w:cs="Arial"/>
+                <w:color w:val="525252" w:themeColor="accent3" w:themeShade="80"/>
+                <w:sz w:val="20"/>
+                <w:szCs w:val="20"/>
+              </w:rPr>
+              <w:t>Abracopel</w:t>
+            </w:r>
+            <w:proofErr w:type="spellEnd"/>
+            <w:r>
+              <w:rPr>
+                <w:rFonts w:ascii="Arial" w:eastAsia="Arial" w:hAnsi="Arial" w:cs="Arial"/>
+                <w:color w:val="525252" w:themeColor="accent3" w:themeShade="80"/>
+                <w:sz w:val="20"/>
+                <w:szCs w:val="20"/>
+              </w:rPr>
+              <w:t>, 2024.</w:t>
+            </w:r>
+          </w:p>
+          <w:p>
+            <w:pPr>
+              <w:spacing w:after="0" w:line="240" w:lineRule="auto"/>
+              <w:rPr>
+                <w:rFonts w:ascii="Arial" w:eastAsia="Arial" w:hAnsi="Arial" w:cs="Arial"/>
+                <w:color w:val="525252" w:themeColor="accent3" w:themeShade="80"/>
+                <w:sz w:val="20"/>
+                <w:szCs w:val="20"/>
+              </w:rPr>
+            </w:pPr>
+            <w:r>
+              <w:rPr>
+                <w:rFonts w:ascii="Arial" w:eastAsia="Arial" w:hAnsi="Arial" w:cs="Arial"/>
+                <w:color w:val="525252" w:themeColor="accent3" w:themeShade="80"/>
+                <w:sz w:val="20"/>
+                <w:szCs w:val="20"/>
+              </w:rPr>
+              <w:t>EMPRESA DE PESQUISA ENERGÉTICA (EPE). Boletim Trimestral de Consumo de Eletricidade (1º Trimestre 2024). Rio de Janeiro: EPE, 2024.</w:t>
+            </w:r>
+          </w:p>
+          <w:p>
+            <w:pPr>
+              <w:spacing w:after="0" w:line="240" w:lineRule="auto"/>
+              <w:rPr>
+                <w:rFonts w:ascii="Arial" w:eastAsia="Arial" w:hAnsi="Arial" w:cs="Arial"/>
+                <w:color w:val="525252" w:themeColor="accent3" w:themeShade="80"/>
+                <w:sz w:val="20"/>
+                <w:szCs w:val="20"/>
+              </w:rPr>
+            </w:pPr>
+            <w:r>
+              <w:rPr>
+                <w:rFonts w:ascii="Arial" w:eastAsia="Arial" w:hAnsi="Arial" w:cs="Arial"/>
+                <w:color w:val="525252" w:themeColor="accent3" w:themeShade="80"/>
+                <w:sz w:val="20"/>
+                <w:szCs w:val="20"/>
+              </w:rPr>
+              <w:t xml:space="preserve">ESPRESSIF SYSTEMS. ESP32 </w:t>
+            </w:r>
+            <w:proofErr w:type="spellStart"/>
+            <w:r>
+              <w:rPr>
+                <w:rFonts w:ascii="Arial" w:eastAsia="Arial" w:hAnsi="Arial" w:cs="Arial"/>
+                <w:color w:val="525252" w:themeColor="accent3" w:themeShade="80"/>
+                <w:sz w:val="20"/>
+                <w:szCs w:val="20"/>
+              </w:rPr>
+              <w:t>Technical</w:t>
+            </w:r>
+            <w:proofErr w:type="spellEnd"/>
+            <w:r>
+              <w:rPr>
+                <w:rFonts w:ascii="Arial" w:eastAsia="Arial" w:hAnsi="Arial" w:cs="Arial"/>
+                <w:color w:val="525252" w:themeColor="accent3" w:themeShade="80"/>
+                <w:sz w:val="20"/>
+                <w:szCs w:val="20"/>
+              </w:rPr>
+              <w:t xml:space="preserve"> </w:t>
+            </w:r>
+            <w:proofErr w:type="spellStart"/>
+            <w:r>
+              <w:rPr>
+                <w:rFonts w:ascii="Arial" w:eastAsia="Arial" w:hAnsi="Arial" w:cs="Arial"/>
+                <w:color w:val="525252" w:themeColor="accent3" w:themeShade="80"/>
+                <w:sz w:val="20"/>
+                <w:szCs w:val="20"/>
+              </w:rPr>
+              <w:t>Reference</w:t>
+            </w:r>
+            <w:proofErr w:type="spellEnd"/>
+            <w:r>
+              <w:rPr>
+                <w:rFonts w:ascii="Arial" w:eastAsia="Arial" w:hAnsi="Arial" w:cs="Arial"/>
+                <w:color w:val="525252" w:themeColor="accent3" w:themeShade="80"/>
+                <w:sz w:val="20"/>
+                <w:szCs w:val="20"/>
+              </w:rPr>
+              <w:t xml:space="preserve"> Manual. </w:t>
+            </w:r>
+            <w:proofErr w:type="spellStart"/>
+            <w:r>
+              <w:rPr>
+                <w:rFonts w:ascii="Arial" w:eastAsia="Arial" w:hAnsi="Arial" w:cs="Arial"/>
+                <w:color w:val="525252" w:themeColor="accent3" w:themeShade="80"/>
+                <w:sz w:val="20"/>
+                <w:szCs w:val="20"/>
+              </w:rPr>
+              <w:t>Version</w:t>
+            </w:r>
+            <w:proofErr w:type="spellEnd"/>
+            <w:r>
+              <w:rPr>
+                <w:rFonts w:ascii="Arial" w:eastAsia="Arial" w:hAnsi="Arial" w:cs="Arial"/>
+                <w:color w:val="525252" w:themeColor="accent3" w:themeShade="80"/>
+                <w:sz w:val="20"/>
+                <w:szCs w:val="20"/>
+              </w:rPr>
+              <w:t xml:space="preserve"> 5.3. Shanghai, 2024.</w:t>
+            </w:r>
+          </w:p>
+          <w:p>
+            <w:pPr>
+              <w:spacing w:after="0" w:line="240" w:lineRule="auto"/>
+              <w:rPr>
+                <w:rFonts w:ascii="Arial" w:eastAsia="Arial" w:hAnsi="Arial" w:cs="Arial"/>
                 <w:color w:val="1F4E79"/>
                 <w:sz w:val="20"/>
                 <w:szCs w:val="20"/>
-              </w:rPr>
-            </w:pPr>
-            <w:r>
-              <w:rPr>
-                <w:rFonts w:ascii="Arial" w:eastAsia="Arial" w:hAnsi="Arial" w:cs="Arial"/>
-                <w:color w:val="525252" w:themeColor="accent3" w:themeShade="80"/>
-                <w:sz w:val="20"/>
-                <w:szCs w:val="20"/>
-              </w:rPr>
-              <w:t>Inserir os dados neste espaço. Orientações: Adotar a versão atual da ABNT.</w:t>
+                <w:lang w:val="en-US"/>
+              </w:rPr>
+            </w:pPr>
+            <w:r>
+              <w:rPr>
+                <w:rFonts w:ascii="Arial" w:eastAsia="Arial" w:hAnsi="Arial" w:cs="Arial"/>
+                <w:color w:val="525252" w:themeColor="accent3" w:themeShade="80"/>
+                <w:sz w:val="20"/>
+                <w:szCs w:val="20"/>
+                <w:lang w:val="en-US"/>
+              </w:rPr>
+              <w:t>OASIS STANDARD. MQTT Version 3.1.1. OASIS, 2014.</w:t>
             </w:r>
           </w:p>
         </w:tc>
@@ -2513,50 +2830,55 @@
           <w:b/>
           <w:sz w:val="20"/>
           <w:szCs w:val="20"/>
-        </w:rPr>
-      </w:pPr>
-    </w:p>
-    <w:p>
-      <w:pPr>
-        <w:spacing w:after="0" w:line="240" w:lineRule="auto"/>
-        <w:rPr>
-          <w:rFonts w:ascii="Arial" w:eastAsia="Arial" w:hAnsi="Arial" w:cs="Arial"/>
-          <w:b/>
-          <w:sz w:val="20"/>
-          <w:szCs w:val="20"/>
-        </w:rPr>
-      </w:pPr>
-    </w:p>
-    <w:p>
-      <w:pPr>
-        <w:spacing w:after="0" w:line="240" w:lineRule="auto"/>
-        <w:rPr>
-          <w:rFonts w:ascii="Arial" w:eastAsia="Arial" w:hAnsi="Arial" w:cs="Arial"/>
-          <w:b/>
-          <w:sz w:val="20"/>
-          <w:szCs w:val="20"/>
-        </w:rPr>
-      </w:pPr>
-    </w:p>
-    <w:p>
-      <w:pPr>
-        <w:spacing w:after="0" w:line="240" w:lineRule="auto"/>
-        <w:rPr>
-          <w:rFonts w:ascii="Arial" w:eastAsia="Arial" w:hAnsi="Arial" w:cs="Arial"/>
-          <w:b/>
-          <w:sz w:val="20"/>
-          <w:szCs w:val="20"/>
-        </w:rPr>
-      </w:pPr>
-    </w:p>
-    <w:p>
-      <w:pPr>
-        <w:spacing w:after="0" w:line="240" w:lineRule="auto"/>
-        <w:rPr>
-          <w:rFonts w:ascii="Arial" w:eastAsia="Arial" w:hAnsi="Arial" w:cs="Arial"/>
-          <w:b/>
-          <w:sz w:val="20"/>
-          <w:szCs w:val="20"/>
+          <w:lang w:val="en-US"/>
+        </w:rPr>
+      </w:pPr>
+    </w:p>
+    <w:p>
+      <w:pPr>
+        <w:spacing w:after="0" w:line="240" w:lineRule="auto"/>
+        <w:rPr>
+          <w:rFonts w:ascii="Arial" w:eastAsia="Arial" w:hAnsi="Arial" w:cs="Arial"/>
+          <w:b/>
+          <w:sz w:val="20"/>
+          <w:szCs w:val="20"/>
+          <w:lang w:val="en-US"/>
+        </w:rPr>
+      </w:pPr>
+    </w:p>
+    <w:p>
+      <w:pPr>
+        <w:spacing w:after="0" w:line="240" w:lineRule="auto"/>
+        <w:rPr>
+          <w:rFonts w:ascii="Arial" w:eastAsia="Arial" w:hAnsi="Arial" w:cs="Arial"/>
+          <w:b/>
+          <w:sz w:val="20"/>
+          <w:szCs w:val="20"/>
+          <w:lang w:val="en-US"/>
+        </w:rPr>
+      </w:pPr>
+    </w:p>
+    <w:p>
+      <w:pPr>
+        <w:spacing w:after="0" w:line="240" w:lineRule="auto"/>
+        <w:rPr>
+          <w:rFonts w:ascii="Arial" w:eastAsia="Arial" w:hAnsi="Arial" w:cs="Arial"/>
+          <w:b/>
+          <w:sz w:val="20"/>
+          <w:szCs w:val="20"/>
+          <w:lang w:val="en-US"/>
+        </w:rPr>
+      </w:pPr>
+    </w:p>
+    <w:p>
+      <w:pPr>
+        <w:spacing w:after="0" w:line="240" w:lineRule="auto"/>
+        <w:rPr>
+          <w:rFonts w:ascii="Arial" w:eastAsia="Arial" w:hAnsi="Arial" w:cs="Arial"/>
+          <w:b/>
+          <w:sz w:val="20"/>
+          <w:szCs w:val="20"/>
+          <w:lang w:val="en-US"/>
         </w:rPr>
       </w:pPr>
     </w:p>
@@ -2569,6 +2891,7 @@
           <w:b/>
           <w:sz w:val="20"/>
           <w:szCs w:val="20"/>
+          <w:lang w:val="en-US"/>
         </w:rPr>
       </w:pPr>
     </w:p>
@@ -2677,7 +3000,7 @@
     </w:p>
     <w:tbl>
       <w:tblPr>
-        <w:tblW w:w="9435" w:type="dxa"/>
+        <w:tblW w:w="9351" w:type="dxa"/>
         <w:tblBorders>
           <w:top w:val="single" w:sz="4" w:space="0" w:color="000000"/>
           <w:left w:val="single" w:sz="4" w:space="0" w:color="000000"/>
@@ -2690,16 +3013,17 @@
         <w:tblLook w:val="0400" w:firstRow="0" w:lastRow="0" w:firstColumn="0" w:lastColumn="0" w:noHBand="0" w:noVBand="1"/>
       </w:tblPr>
       <w:tblGrid>
-        <w:gridCol w:w="3037"/>
-        <w:gridCol w:w="6398"/>
+        <w:gridCol w:w="4957"/>
+        <w:gridCol w:w="4394"/>
       </w:tblGrid>
       <w:tr>
         <w:tc>
           <w:tcPr>
-            <w:tcW w:w="3037" w:type="dxa"/>
+            <w:tcW w:w="4957" w:type="dxa"/>
           </w:tcPr>
           <w:p>
             <w:pPr>
+              <w:spacing w:after="0"/>
               <w:rPr>
                 <w:rFonts w:ascii="Arial" w:eastAsia="Arial" w:hAnsi="Arial" w:cs="Arial"/>
                 <w:b/>
@@ -2715,15 +3039,214 @@
                 <w:szCs w:val="20"/>
               </w:rPr>
               <w:t>Fontes:</w:t>
+            </w:r>
+          </w:p>
+          <w:p>
+            <w:pPr>
+              <w:spacing w:after="0"/>
+              <w:rPr>
+                <w:rFonts w:ascii="Arial" w:eastAsia="Arial" w:hAnsi="Arial" w:cs="Arial"/>
+                <w:b/>
+                <w:sz w:val="20"/>
+                <w:szCs w:val="20"/>
+              </w:rPr>
+            </w:pPr>
+            <w:r>
+              <w:rPr>
+                <w:rFonts w:ascii="Arial" w:eastAsia="Arial" w:hAnsi="Arial" w:cs="Arial"/>
+                <w:b/>
+                <w:bCs/>
+                <w:sz w:val="20"/>
+                <w:szCs w:val="20"/>
+              </w:rPr>
+              <w:t>ABRACOPEL</w:t>
+            </w:r>
+            <w:r>
+              <w:rPr>
+                <w:rFonts w:ascii="Arial" w:eastAsia="Arial" w:hAnsi="Arial" w:cs="Arial"/>
+                <w:b/>
+                <w:sz w:val="20"/>
+                <w:szCs w:val="20"/>
+              </w:rPr>
+              <w:t xml:space="preserve"> – Anuário Estatístico de Acidentes de Origem </w:t>
+            </w:r>
+            <w:proofErr w:type="spellStart"/>
+            <w:r>
+              <w:rPr>
+                <w:rFonts w:ascii="Arial" w:eastAsia="Arial" w:hAnsi="Arial" w:cs="Arial"/>
+                <w:b/>
+                <w:sz w:val="20"/>
+                <w:szCs w:val="20"/>
+              </w:rPr>
+              <w:t>Elétrica</w:t>
+            </w:r>
+            <w:r>
+              <w:rPr>
+                <w:rFonts w:ascii="Arial" w:eastAsia="Arial" w:hAnsi="Arial" w:cs="Arial"/>
+                <w:b/>
+                <w:bCs/>
+                <w:sz w:val="20"/>
+                <w:szCs w:val="20"/>
+              </w:rPr>
+              <w:t>CCEE</w:t>
+            </w:r>
+            <w:proofErr w:type="spellEnd"/>
+            <w:r>
+              <w:rPr>
+                <w:rFonts w:ascii="Arial" w:eastAsia="Arial" w:hAnsi="Arial" w:cs="Arial"/>
+                <w:b/>
+                <w:sz w:val="20"/>
+                <w:szCs w:val="20"/>
+              </w:rPr>
+              <w:t xml:space="preserve"> – Câmara de Comercialização de Energia Elétrica</w:t>
+            </w:r>
+          </w:p>
+          <w:p>
+            <w:pPr>
+              <w:spacing w:after="0"/>
+              <w:rPr>
+                <w:rFonts w:ascii="Arial" w:eastAsia="Arial" w:hAnsi="Arial" w:cs="Arial"/>
+                <w:b/>
+                <w:sz w:val="20"/>
+                <w:szCs w:val="20"/>
+              </w:rPr>
+            </w:pPr>
+            <w:r>
+              <w:rPr>
+                <w:rFonts w:ascii="Arial" w:eastAsia="Arial" w:hAnsi="Arial" w:cs="Arial"/>
+                <w:b/>
+                <w:bCs/>
+                <w:sz w:val="20"/>
+                <w:szCs w:val="20"/>
+              </w:rPr>
+              <w:t>EPE</w:t>
+            </w:r>
+            <w:r>
+              <w:rPr>
+                <w:rFonts w:ascii="Arial" w:eastAsia="Arial" w:hAnsi="Arial" w:cs="Arial"/>
+                <w:b/>
+                <w:sz w:val="20"/>
+                <w:szCs w:val="20"/>
+              </w:rPr>
+              <w:t xml:space="preserve"> – Empresa de Pesquisa Energética (Anuário e Boletins)</w:t>
+            </w:r>
+            <w:r>
+              <w:rPr>
+                <w:rFonts w:ascii="Arial" w:eastAsia="Arial" w:hAnsi="Arial" w:cs="Arial"/>
+                <w:b/>
+                <w:sz w:val="20"/>
+                <w:szCs w:val="20"/>
+              </w:rPr>
+              <w:t xml:space="preserve"> </w:t>
+            </w:r>
+          </w:p>
+          <w:p>
+            <w:pPr>
+              <w:spacing w:after="0"/>
+              <w:rPr>
+                <w:rFonts w:ascii="Arial" w:eastAsia="Arial" w:hAnsi="Arial" w:cs="Arial"/>
+                <w:b/>
+                <w:sz w:val="20"/>
+                <w:szCs w:val="20"/>
+              </w:rPr>
+            </w:pPr>
+            <w:r>
+              <w:rPr>
+                <w:rFonts w:ascii="Arial" w:eastAsia="Arial" w:hAnsi="Arial" w:cs="Arial"/>
+                <w:b/>
+                <w:bCs/>
+                <w:sz w:val="20"/>
+                <w:szCs w:val="20"/>
+              </w:rPr>
+              <w:t>ESPRESSIF</w:t>
+            </w:r>
+            <w:r>
+              <w:rPr>
+                <w:rFonts w:ascii="Arial" w:eastAsia="Arial" w:hAnsi="Arial" w:cs="Arial"/>
+                <w:b/>
+                <w:sz w:val="20"/>
+                <w:szCs w:val="20"/>
+              </w:rPr>
+              <w:t xml:space="preserve"> – Documentação Técnica ESP32</w:t>
+            </w:r>
+          </w:p>
+          <w:p>
+            <w:pPr>
+              <w:spacing w:after="0"/>
+              <w:rPr>
+                <w:rFonts w:ascii="Arial" w:eastAsia="Arial" w:hAnsi="Arial" w:cs="Arial"/>
+                <w:b/>
+                <w:sz w:val="20"/>
+                <w:szCs w:val="20"/>
+              </w:rPr>
+            </w:pPr>
+            <w:r>
+              <w:rPr>
+                <w:rFonts w:ascii="Arial" w:eastAsia="Arial" w:hAnsi="Arial" w:cs="Arial"/>
+                <w:b/>
+                <w:bCs/>
+                <w:sz w:val="20"/>
+                <w:szCs w:val="20"/>
+              </w:rPr>
+              <w:t>REASE</w:t>
+            </w:r>
+            <w:r>
+              <w:rPr>
+                <w:rFonts w:ascii="Arial" w:eastAsia="Arial" w:hAnsi="Arial" w:cs="Arial"/>
+                <w:b/>
+                <w:sz w:val="20"/>
+                <w:szCs w:val="20"/>
+              </w:rPr>
+              <w:t xml:space="preserve"> – Estudo sobre Tarifa de Energia Elétrica (DOI)</w:t>
+            </w:r>
+            <w:r>
+              <w:rPr>
+                <w:rFonts w:ascii="Arial" w:eastAsia="Arial" w:hAnsi="Arial" w:cs="Arial"/>
+                <w:b/>
+                <w:sz w:val="20"/>
+                <w:szCs w:val="20"/>
+              </w:rPr>
+              <w:t xml:space="preserve"> </w:t>
+            </w:r>
+          </w:p>
+          <w:p>
+            <w:pPr>
+              <w:spacing w:after="0"/>
+              <w:rPr>
+                <w:rFonts w:ascii="Arial" w:eastAsia="Arial" w:hAnsi="Arial" w:cs="Arial"/>
+                <w:b/>
+                <w:sz w:val="20"/>
+                <w:szCs w:val="20"/>
+              </w:rPr>
+            </w:pPr>
+            <w:r>
+              <w:rPr>
+                <w:rFonts w:ascii="Arial" w:eastAsia="Arial" w:hAnsi="Arial" w:cs="Arial"/>
+                <w:b/>
+                <w:bCs/>
+                <w:sz w:val="20"/>
+                <w:szCs w:val="20"/>
+              </w:rPr>
+              <w:t>MQTT</w:t>
+            </w:r>
+            <w:r>
+              <w:rPr>
+                <w:rFonts w:ascii="Arial" w:eastAsia="Arial" w:hAnsi="Arial" w:cs="Arial"/>
+                <w:b/>
+                <w:sz w:val="20"/>
+                <w:szCs w:val="20"/>
+              </w:rPr>
+              <w:t xml:space="preserve"> – Documentação do Protocolo de Mensageria IoT</w:t>
             </w:r>
           </w:p>
         </w:tc>
         <w:tc>
           <w:tcPr>
-            <w:tcW w:w="6398" w:type="dxa"/>
+            <w:tcW w:w="4394" w:type="dxa"/>
           </w:tcPr>
           <w:p>
             <w:pPr>
+              <w:spacing w:after="0"/>
               <w:rPr>
                 <w:rFonts w:ascii="Arial" w:eastAsia="Arial" w:hAnsi="Arial" w:cs="Arial"/>
                 <w:b/>
@@ -2739,6 +3262,186 @@
                 <w:szCs w:val="20"/>
               </w:rPr>
               <w:t>Links:</w:t>
+            </w:r>
+          </w:p>
+          <w:p>
+            <w:pPr>
+              <w:spacing w:after="0"/>
+              <w:rPr>
+                <w:rFonts w:ascii="Arial" w:eastAsia="Arial" w:hAnsi="Arial" w:cs="Arial"/>
+                <w:b/>
+                <w:sz w:val="20"/>
+                <w:szCs w:val="20"/>
+              </w:rPr>
+            </w:pPr>
+            <w:hyperlink r:id="rId10" w:history="1">
+              <w:r>
+                <w:rPr>
+                  <w:rStyle w:val="Hyperlink"/>
+                  <w:rFonts w:ascii="Arial" w:eastAsia="Arial" w:hAnsi="Arial" w:cs="Arial"/>
+                  <w:b/>
+                  <w:sz w:val="20"/>
+                  <w:szCs w:val="20"/>
+                </w:rPr>
+                <w:t>https://abracopel.org/estatisticas/</w:t>
+              </w:r>
+            </w:hyperlink>
+          </w:p>
+          <w:p>
+            <w:pPr>
+              <w:spacing w:after="0"/>
+              <w:rPr>
+                <w:rFonts w:ascii="Arial" w:eastAsia="Arial" w:hAnsi="Arial" w:cs="Arial"/>
+                <w:b/>
+                <w:sz w:val="20"/>
+                <w:szCs w:val="20"/>
+              </w:rPr>
+            </w:pPr>
+            <w:hyperlink r:id="rId11" w:history="1">
+              <w:r>
+                <w:rPr>
+                  <w:rStyle w:val="Hyperlink"/>
+                  <w:rFonts w:ascii="Arial" w:eastAsia="Arial" w:hAnsi="Arial" w:cs="Arial"/>
+                  <w:b/>
+                  <w:sz w:val="20"/>
+                  <w:szCs w:val="20"/>
+                </w:rPr>
+                <w:t>https://www.ccee.org.br/</w:t>
+              </w:r>
+            </w:hyperlink>
+          </w:p>
+          <w:p>
+            <w:pPr>
+              <w:spacing w:after="0"/>
+              <w:rPr>
+                <w:rFonts w:ascii="Arial" w:eastAsia="Arial" w:hAnsi="Arial" w:cs="Arial"/>
+                <w:b/>
+                <w:sz w:val="20"/>
+                <w:szCs w:val="20"/>
+              </w:rPr>
+            </w:pPr>
+          </w:p>
+          <w:p>
+            <w:pPr>
+              <w:spacing w:after="0"/>
+              <w:rPr>
+                <w:rFonts w:ascii="Arial" w:eastAsia="Arial" w:hAnsi="Arial" w:cs="Arial"/>
+                <w:b/>
+                <w:sz w:val="20"/>
+                <w:szCs w:val="20"/>
+              </w:rPr>
+            </w:pPr>
+            <w:hyperlink r:id="rId12" w:history="1">
+              <w:r>
+                <w:rPr>
+                  <w:rStyle w:val="Hyperlink"/>
+                  <w:rFonts w:ascii="Arial" w:eastAsia="Arial" w:hAnsi="Arial" w:cs="Arial"/>
+                  <w:b/>
+                  <w:sz w:val="20"/>
+                  <w:szCs w:val="20"/>
+                </w:rPr>
+                <w:t>https://www.epe.gov.br/</w:t>
+              </w:r>
+            </w:hyperlink>
+          </w:p>
+          <w:p>
+            <w:pPr>
+              <w:spacing w:after="0"/>
+              <w:rPr>
+                <w:rFonts w:ascii="Arial" w:eastAsia="Arial" w:hAnsi="Arial" w:cs="Arial"/>
+                <w:b/>
+                <w:sz w:val="20"/>
+                <w:szCs w:val="20"/>
+              </w:rPr>
+            </w:pPr>
+          </w:p>
+          <w:p>
+            <w:pPr>
+              <w:spacing w:after="0"/>
+              <w:rPr>
+                <w:rFonts w:ascii="Arial" w:eastAsia="Arial" w:hAnsi="Arial" w:cs="Arial"/>
+                <w:b/>
+                <w:sz w:val="20"/>
+                <w:szCs w:val="20"/>
+              </w:rPr>
+            </w:pPr>
+            <w:hyperlink r:id="rId13" w:history="1">
+              <w:r>
+                <w:rPr>
+                  <w:rStyle w:val="Hyperlink"/>
+                  <w:rFonts w:ascii="Arial" w:eastAsia="Arial" w:hAnsi="Arial" w:cs="Arial"/>
+                  <w:b/>
+                  <w:sz w:val="20"/>
+                  <w:szCs w:val="20"/>
+                </w:rPr>
+                <w:t>https://www.espressif.com/</w:t>
+              </w:r>
+            </w:hyperlink>
+          </w:p>
+          <w:p>
+            <w:pPr>
+              <w:spacing w:after="0"/>
+              <w:rPr>
+                <w:rFonts w:ascii="Arial" w:eastAsia="Arial" w:hAnsi="Arial" w:cs="Arial"/>
+                <w:b/>
+                <w:sz w:val="20"/>
+                <w:szCs w:val="20"/>
+              </w:rPr>
+            </w:pPr>
+            <w:hyperlink r:id="rId14" w:history="1">
+              <w:r>
+                <w:rPr>
+                  <w:rStyle w:val="Hyperlink"/>
+                  <w:rFonts w:ascii="Arial" w:eastAsia="Arial" w:hAnsi="Arial" w:cs="Arial"/>
+                  <w:b/>
+                  <w:sz w:val="20"/>
+                  <w:szCs w:val="20"/>
+                </w:rPr>
+                <w:t>https://doi.org/10.51891/rease.v10i10.16422</w:t>
+              </w:r>
+            </w:hyperlink>
+          </w:p>
+          <w:p>
+            <w:pPr>
+              <w:spacing w:after="0"/>
+              <w:rPr>
+                <w:rFonts w:ascii="Arial" w:eastAsia="Arial" w:hAnsi="Arial" w:cs="Arial"/>
+                <w:b/>
+                <w:sz w:val="20"/>
+                <w:szCs w:val="20"/>
+              </w:rPr>
+            </w:pPr>
+          </w:p>
+          <w:p>
+            <w:pPr>
+              <w:spacing w:after="0"/>
+              <w:rPr>
+                <w:rFonts w:ascii="Arial" w:eastAsia="Arial" w:hAnsi="Arial" w:cs="Arial"/>
+                <w:b/>
+                <w:sz w:val="20"/>
+                <w:szCs w:val="20"/>
+              </w:rPr>
+            </w:pPr>
+            <w:hyperlink r:id="rId15" w:history="1">
+              <w:r>
+                <w:rPr>
+                  <w:rStyle w:val="Hyperlink"/>
+                  <w:rFonts w:ascii="Arial" w:eastAsia="Arial" w:hAnsi="Arial" w:cs="Arial"/>
+                  <w:b/>
+                  <w:sz w:val="20"/>
+                  <w:szCs w:val="20"/>
+                </w:rPr>
+                <w:t>https://mqtt.org/</w:t>
+              </w:r>
+            </w:hyperlink>
+            <w:r>
+              <w:rPr>
+                <w:rFonts w:ascii="Arial" w:eastAsia="Arial" w:hAnsi="Arial" w:cs="Arial"/>
+                <w:b/>
+                <w:sz w:val="20"/>
+                <w:szCs w:val="20"/>
+              </w:rPr>
+              <w:t xml:space="preserve"> </w:t>
             </w:r>
           </w:p>
         </w:tc>
@@ -2756,7 +3459,7 @@
     </w:p>
     <w:tbl>
       <w:tblPr>
-        <w:tblW w:w="9345" w:type="dxa"/>
+        <w:tblW w:w="9351" w:type="dxa"/>
         <w:tblBorders>
           <w:top w:val="single" w:sz="4" w:space="0" w:color="000000"/>
           <w:left w:val="single" w:sz="4" w:space="0" w:color="000000"/>
@@ -2770,7 +3473,7 @@
       </w:tblPr>
       <w:tblGrid>
         <w:gridCol w:w="3046"/>
-        <w:gridCol w:w="6299"/>
+        <w:gridCol w:w="6305"/>
       </w:tblGrid>
       <w:tr>
         <w:tc>
@@ -2793,14 +3496,13 @@
                 <w:sz w:val="20"/>
                 <w:szCs w:val="20"/>
               </w:rPr>
-              <w:lastRenderedPageBreak/>
               <w:t>Documentos FECAP</w:t>
             </w:r>
           </w:p>
         </w:tc>
         <w:tc>
           <w:tcPr>
-            <w:tcW w:w="6299" w:type="dxa"/>
+            <w:tcW w:w="6305" w:type="dxa"/>
           </w:tcPr>
           <w:p>
             <w:pPr>
@@ -2838,7 +3540,7 @@
         </w:tc>
         <w:tc>
           <w:tcPr>
-            <w:tcW w:w="6299" w:type="dxa"/>
+            <w:tcW w:w="6305" w:type="dxa"/>
           </w:tcPr>
           <w:p>
             <w:pPr>
@@ -2882,12 +3584,12 @@
       </w:r>
     </w:p>
     <w:sectPr>
-      <w:headerReference w:type="even" r:id="rId10"/>
-      <w:headerReference w:type="default" r:id="rId11"/>
-      <w:footerReference w:type="even" r:id="rId12"/>
-      <w:footerReference w:type="default" r:id="rId13"/>
-      <w:headerReference w:type="first" r:id="rId14"/>
-      <w:footerReference w:type="first" r:id="rId15"/>
+      <w:headerReference w:type="even" r:id="rId16"/>
+      <w:headerReference w:type="default" r:id="rId17"/>
+      <w:footerReference w:type="even" r:id="rId18"/>
+      <w:footerReference w:type="default" r:id="rId19"/>
+      <w:headerReference w:type="first" r:id="rId20"/>
+      <w:footerReference w:type="first" r:id="rId21"/>
       <w:pgSz w:w="11906" w:h="16838"/>
       <w:pgMar w:top="1985" w:right="991" w:bottom="1560" w:left="1701" w:header="708" w:footer="708" w:gutter="0"/>
       <w:cols w:space="708"/>
@@ -3155,8 +3857,100 @@
       </w:pPr>
     </w:lvl>
   </w:abstractNum>
+  <w:abstractNum w:abstractNumId="1" w15:restartNumberingAfterBreak="0">
+    <w:nsid w:val="1CAF1429"/>
+    <w:multiLevelType w:val="multilevel"/>
+    <w:tmpl w:val="F8E89BEE"/>
+    <w:lvl w:ilvl="0">
+      <w:start w:val="1"/>
+      <w:numFmt w:val="bullet"/>
+      <w:lvlText w:val=""/>
+      <w:lvlJc w:val="left"/>
+      <w:pPr>
+        <w:ind w:left="720" w:hanging="360"/>
+      </w:pPr>
+      <w:rPr>
+        <w:rFonts w:ascii="Symbol" w:hAnsi="Symbol" w:hint="default"/>
+      </w:rPr>
+    </w:lvl>
+    <w:lvl w:ilvl="1">
+      <w:start w:val="1"/>
+      <w:numFmt w:val="decimal"/>
+      <w:lvlText w:val="%2."/>
+      <w:lvlJc w:val="left"/>
+      <w:pPr>
+        <w:ind w:left="1440" w:hanging="360"/>
+      </w:pPr>
+    </w:lvl>
+    <w:lvl w:ilvl="2">
+      <w:start w:val="1"/>
+      <w:numFmt w:val="decimal"/>
+      <w:lvlText w:val="%3."/>
+      <w:lvlJc w:val="left"/>
+      <w:pPr>
+        <w:ind w:left="2160" w:hanging="360"/>
+      </w:pPr>
+    </w:lvl>
+    <w:lvl w:ilvl="3">
+      <w:start w:val="1"/>
+      <w:numFmt w:val="decimal"/>
+      <w:lvlText w:val="%4."/>
+      <w:lvlJc w:val="left"/>
+      <w:pPr>
+        <w:ind w:left="2880" w:hanging="360"/>
+      </w:pPr>
+    </w:lvl>
+    <w:lvl w:ilvl="4">
+      <w:start w:val="1"/>
+      <w:numFmt w:val="decimal"/>
+      <w:lvlText w:val="%5."/>
+      <w:lvlJc w:val="left"/>
+      <w:pPr>
+        <w:ind w:left="3600" w:hanging="360"/>
+      </w:pPr>
+    </w:lvl>
+    <w:lvl w:ilvl="5">
+      <w:start w:val="1"/>
+      <w:numFmt w:val="decimal"/>
+      <w:lvlText w:val="%6."/>
+      <w:lvlJc w:val="left"/>
+      <w:pPr>
+        <w:ind w:left="4320" w:hanging="360"/>
+      </w:pPr>
+    </w:lvl>
+    <w:lvl w:ilvl="6">
+      <w:start w:val="1"/>
+      <w:numFmt w:val="decimal"/>
+      <w:lvlText w:val="%7."/>
+      <w:lvlJc w:val="left"/>
+      <w:pPr>
+        <w:ind w:left="5040" w:hanging="360"/>
+      </w:pPr>
+    </w:lvl>
+    <w:lvl w:ilvl="7">
+      <w:start w:val="1"/>
+      <w:numFmt w:val="decimal"/>
+      <w:lvlText w:val="%8."/>
+      <w:lvlJc w:val="left"/>
+      <w:pPr>
+        <w:ind w:left="5760" w:hanging="360"/>
+      </w:pPr>
+    </w:lvl>
+    <w:lvl w:ilvl="8">
+      <w:start w:val="1"/>
+      <w:numFmt w:val="decimal"/>
+      <w:lvlText w:val="%9."/>
+      <w:lvlJc w:val="left"/>
+      <w:pPr>
+        <w:ind w:left="6480" w:hanging="360"/>
+      </w:pPr>
+    </w:lvl>
+  </w:abstractNum>
   <w:num w:numId="1" w16cid:durableId="897862257">
     <w:abstractNumId w:val="0"/>
+  </w:num>
+  <w:num w:numId="2" w16cid:durableId="775097832">
+    <w:abstractNumId w:val="1"/>
   </w:num>
 </w:numbering>
 </file>
@@ -3567,7 +4361,6 @@
   <w:style w:type="character" w:default="1" w:styleId="Fontepargpadro">
     <w:name w:val="Default Paragraph Font"/>
     <w:uiPriority w:val="1"/>
-    <w:semiHidden/>
     <w:unhideWhenUsed/>
   </w:style>
   <w:style w:type="table" w:default="1" w:styleId="Tabelanormal">
@@ -3634,6 +4427,40 @@
     <w:link w:val="Rodap"/>
     <w:uiPriority w:val="99"/>
     <w:rsid w:val="000425C6"/>
+  </w:style>
+  <w:style w:type="paragraph" w:styleId="PargrafodaLista">
+    <w:name w:val="List Paragraph"/>
+    <w:basedOn w:val="Normal"/>
+    <w:uiPriority w:val="34"/>
+    <w:qFormat/>
+    <w:rsid w:val="00445A13"/>
+    <w:pPr>
+      <w:ind w:left="720"/>
+      <w:contextualSpacing/>
+    </w:pPr>
+  </w:style>
+  <w:style w:type="character" w:styleId="Hyperlink">
+    <w:name w:val="Hyperlink"/>
+    <w:basedOn w:val="Fontepargpadro"/>
+    <w:uiPriority w:val="99"/>
+    <w:unhideWhenUsed/>
+    <w:rsid w:val="00133717"/>
+    <w:rPr>
+      <w:color w:val="0563C1" w:themeColor="hyperlink"/>
+      <w:u w:val="single"/>
+    </w:rPr>
+  </w:style>
+  <w:style w:type="character" w:styleId="MenoPendente">
+    <w:name w:val="Unresolved Mention"/>
+    <w:basedOn w:val="Fontepargpadro"/>
+    <w:uiPriority w:val="99"/>
+    <w:semiHidden/>
+    <w:unhideWhenUsed/>
+    <w:rsid w:val="00133717"/>
+    <w:rPr>
+      <w:color w:val="605E5C"/>
+      <w:shd w:val="clear" w:color="auto" w:fill="E1DFDD"/>
+    </w:rPr>
   </w:style>
 </w:styles>
 </file>
@@ -3934,6 +4761,26 @@
 </file>
 
 <file path=customXml/item1.xml><?xml version="1.0" encoding="utf-8"?>
+<?mso-contentType ?>
+<FormTemplates xmlns="http://schemas.microsoft.com/sharepoint/v3/contenttype/forms">
+  <Display>DocumentLibraryForm</Display>
+  <Edit>DocumentLibraryForm</Edit>
+  <New>DocumentLibraryForm</New>
+</FormTemplates>
+</file>
+
+<file path=customXml/item2.xml><?xml version="1.0" encoding="utf-8"?>
+<p:properties xmlns:p="http://schemas.microsoft.com/office/2006/metadata/properties" xmlns:xsi="http://www.w3.org/2001/XMLSchema-instance" xmlns:pc="http://schemas.microsoft.com/office/infopath/2007/PartnerControls">
+  <documentManagement>
+    <lcf76f155ced4ddcb4097134ff3c332f xmlns="8ca2a57e-8138-4b57-956a-eb6e2c7049cc">
+      <Terms xmlns="http://schemas.microsoft.com/office/infopath/2007/PartnerControls"/>
+    </lcf76f155ced4ddcb4097134ff3c332f>
+    <TaxCatchAll xmlns="1d2798d9-1030-4cc5-be7b-200f9e628651" xsi:nil="true"/>
+  </documentManagement>
+</p:properties>
+</file>
+
+<file path=customXml/item3.xml><?xml version="1.0" encoding="utf-8"?>
 <ct:contentTypeSchema xmlns:ct="http://schemas.microsoft.com/office/2006/metadata/contentType" xmlns:ma="http://schemas.microsoft.com/office/2006/metadata/properties/metaAttributes" ct:_="" ma:_="" ma:contentTypeName="Documento" ma:contentTypeID="0x01010045364877AF745B4281652B53F43C594A" ma:contentTypeVersion="15" ma:contentTypeDescription="Crie um novo documento." ma:contentTypeScope="" ma:versionID="440a6fbbcbce65e3f8e2bed610644788">
   <xsd:schema xmlns:xsd="http://www.w3.org/2001/XMLSchema" xmlns:xs="http://www.w3.org/2001/XMLSchema" xmlns:p="http://schemas.microsoft.com/office/2006/metadata/properties" xmlns:ns2="1d2798d9-1030-4cc5-be7b-200f9e628651" xmlns:ns3="8ca2a57e-8138-4b57-956a-eb6e2c7049cc" targetNamespace="http://schemas.microsoft.com/office/2006/metadata/properties" ma:root="true" ma:fieldsID="3ff20d9b6411658b7762fa2c08d7e1af" ns2:_="" ns3:_="">
     <xsd:import namespace="1d2798d9-1030-4cc5-be7b-200f9e628651"/>
@@ -4168,27 +5015,26 @@
 </ct:contentTypeSchema>
 </file>
 
-<file path=customXml/item2.xml><?xml version="1.0" encoding="utf-8"?>
-<p:properties xmlns:p="http://schemas.microsoft.com/office/2006/metadata/properties" xmlns:xsi="http://www.w3.org/2001/XMLSchema-instance" xmlns:pc="http://schemas.microsoft.com/office/infopath/2007/PartnerControls">
-  <documentManagement>
-    <lcf76f155ced4ddcb4097134ff3c332f xmlns="8ca2a57e-8138-4b57-956a-eb6e2c7049cc">
-      <Terms xmlns="http://schemas.microsoft.com/office/infopath/2007/PartnerControls"/>
-    </lcf76f155ced4ddcb4097134ff3c332f>
-    <TaxCatchAll xmlns="1d2798d9-1030-4cc5-be7b-200f9e628651" xsi:nil="true"/>
-  </documentManagement>
-</p:properties>
+<file path=customXml/itemProps1.xml><?xml version="1.0" encoding="utf-8"?>
+<ds:datastoreItem xmlns:ds="http://schemas.openxmlformats.org/officeDocument/2006/customXml" ds:itemID="{6C7D064E-B9B1-4DD1-96C1-B59BEDBDE508}">
+  <ds:schemaRefs>
+    <ds:schemaRef ds:uri="http://schemas.microsoft.com/sharepoint/v3/contenttype/forms"/>
+  </ds:schemaRefs>
+</ds:datastoreItem>
 </file>
 
-<file path=customXml/item3.xml><?xml version="1.0" encoding="utf-8"?>
-<?mso-contentType ?>
-<FormTemplates xmlns="http://schemas.microsoft.com/sharepoint/v3/contenttype/forms">
-  <Display>DocumentLibraryForm</Display>
-  <Edit>DocumentLibraryForm</Edit>
-  <New>DocumentLibraryForm</New>
-</FormTemplates>
+<file path=customXml/itemProps2.xml><?xml version="1.0" encoding="utf-8"?>
+<ds:datastoreItem xmlns:ds="http://schemas.openxmlformats.org/officeDocument/2006/customXml" ds:itemID="{DEC3F211-A3ED-4D74-812F-955FD328EBB9}">
+  <ds:schemaRefs>
+    <ds:schemaRef ds:uri="http://schemas.microsoft.com/office/2006/metadata/properties"/>
+    <ds:schemaRef ds:uri="http://schemas.microsoft.com/office/infopath/2007/PartnerControls"/>
+    <ds:schemaRef ds:uri="8ca2a57e-8138-4b57-956a-eb6e2c7049cc"/>
+    <ds:schemaRef ds:uri="1d2798d9-1030-4cc5-be7b-200f9e628651"/>
+  </ds:schemaRefs>
+</ds:datastoreItem>
 </file>
 
-<file path=customXml/itemProps1.xml><?xml version="1.0" encoding="utf-8"?>
+<file path=customXml/itemProps3.xml><?xml version="1.0" encoding="utf-8"?>
 <ds:datastoreItem xmlns:ds="http://schemas.openxmlformats.org/officeDocument/2006/customXml" ds:itemID="{5C49EB71-DCC6-4AD6-B283-AD28F75E5568}">
   <ds:schemaRefs>
     <ds:schemaRef ds:uri="http://schemas.microsoft.com/office/2006/metadata/contentType"/>
@@ -4205,23 +5051,4 @@
     <ds:schemaRef ds:uri="http://schemas.microsoft.com/internal/obd"/>
   </ds:schemaRefs>
 </ds:datastoreItem>
-</file>
-
-<file path=customXml/itemProps2.xml><?xml version="1.0" encoding="utf-8"?>
-<ds:datastoreItem xmlns:ds="http://schemas.openxmlformats.org/officeDocument/2006/customXml" ds:itemID="{DEC3F211-A3ED-4D74-812F-955FD328EBB9}">
-  <ds:schemaRefs>
-    <ds:schemaRef ds:uri="http://schemas.microsoft.com/office/2006/metadata/properties"/>
-    <ds:schemaRef ds:uri="http://schemas.microsoft.com/office/infopath/2007/PartnerControls"/>
-    <ds:schemaRef ds:uri="8ca2a57e-8138-4b57-956a-eb6e2c7049cc"/>
-    <ds:schemaRef ds:uri="1d2798d9-1030-4cc5-be7b-200f9e628651"/>
-  </ds:schemaRefs>
-</ds:datastoreItem>
-</file>
-
-<file path=customXml/itemProps3.xml><?xml version="1.0" encoding="utf-8"?>
-<ds:datastoreItem xmlns:ds="http://schemas.openxmlformats.org/officeDocument/2006/customXml" ds:itemID="{6C7D064E-B9B1-4DD1-96C1-B59BEDBDE508}">
-  <ds:schemaRefs>
-    <ds:schemaRef ds:uri="http://schemas.microsoft.com/sharepoint/v3/contenttype/forms"/>
-  </ds:schemaRefs>
-</ds:datastoreItem>
 </file>
</xml_diff>